<commit_message>
bổ sung data quy trình xử lý dữ liệu (data pipeline)
</commit_message>
<xml_diff>
--- a/Báo cáo chính.docx
+++ b/Báo cáo chính.docx
@@ -11669,6 +11669,265 @@
     </w:tbl>
     <w:p>
       <w:pPr>
+        <w:rPr>
+          <w:lang w:val="vi-VN"/>
+        </w:rPr>
+      </w:pPr>
+    </w:p>
+    <w:p>
+      <w:pPr>
+        <w:rPr>
+          <w:lang w:val="en-US"/>
+        </w:rPr>
+      </w:pPr>
+      <w:r>
+        <w:rPr>
+          <w:lang w:val="en-US"/>
+        </w:rPr>
+        <w:t xml:space="preserve">Quy trình xử lý dữ liệu </w:t>
+      </w:r>
+      <w:r>
+        <w:rPr>
+          <w:b/>
+          <w:bCs/>
+          <w:lang w:val="en-US"/>
+        </w:rPr>
+        <w:t>(Data Pipeline):</w:t>
+      </w:r>
+    </w:p>
+    <w:p>
+      <w:pPr>
+        <w:pStyle w:val="ListParagraph"/>
+        <w:numPr>
+          <w:ilvl w:val="0"/>
+          <w:numId w:val="33"/>
+        </w:numPr>
+        <w:rPr>
+          <w:lang w:val="en-US"/>
+        </w:rPr>
+      </w:pPr>
+      <w:r>
+        <w:rPr>
+          <w:b/>
+          <w:bCs/>
+          <w:lang w:val="en-US"/>
+        </w:rPr>
+        <w:t>Extract:</w:t>
+      </w:r>
+      <w:r>
+        <w:rPr>
+          <w:lang w:val="en-US"/>
+        </w:rPr>
+        <w:t xml:space="preserve"> Thu thập dữ liệu từ file CSV Global Superstore.</w:t>
+      </w:r>
+    </w:p>
+    <w:p>
+      <w:pPr>
+        <w:pStyle w:val="ListParagraph"/>
+        <w:numPr>
+          <w:ilvl w:val="0"/>
+          <w:numId w:val="33"/>
+        </w:numPr>
+        <w:rPr>
+          <w:b/>
+          <w:bCs/>
+          <w:lang w:val="en-US"/>
+        </w:rPr>
+      </w:pPr>
+      <w:r>
+        <w:rPr>
+          <w:b/>
+          <w:bCs/>
+          <w:lang w:val="en-US"/>
+        </w:rPr>
+        <w:t>Transform:</w:t>
+      </w:r>
+    </w:p>
+    <w:p>
+      <w:pPr>
+        <w:pStyle w:val="ListParagraph"/>
+        <w:numPr>
+          <w:ilvl w:val="0"/>
+          <w:numId w:val="34"/>
+        </w:numPr>
+        <w:rPr>
+          <w:lang w:val="en-US"/>
+        </w:rPr>
+      </w:pPr>
+      <w:r>
+        <w:rPr>
+          <w:lang w:val="en-US"/>
+        </w:rPr>
+        <w:t>Loại bỏ dữ liệu trùng lặp</w:t>
+      </w:r>
+    </w:p>
+    <w:p>
+      <w:pPr>
+        <w:pStyle w:val="ListParagraph"/>
+        <w:numPr>
+          <w:ilvl w:val="0"/>
+          <w:numId w:val="34"/>
+        </w:numPr>
+        <w:rPr>
+          <w:lang w:val="en-US"/>
+        </w:rPr>
+      </w:pPr>
+      <w:r>
+        <w:rPr>
+          <w:lang w:val="en-US"/>
+        </w:rPr>
+        <w:t>Xử lý giá trị thiếu</w:t>
+      </w:r>
+    </w:p>
+    <w:p>
+      <w:pPr>
+        <w:pStyle w:val="ListParagraph"/>
+        <w:numPr>
+          <w:ilvl w:val="0"/>
+          <w:numId w:val="34"/>
+        </w:numPr>
+        <w:rPr>
+          <w:lang w:val="en-US"/>
+        </w:rPr>
+      </w:pPr>
+      <w:r>
+        <w:rPr>
+          <w:lang w:val="en-US"/>
+        </w:rPr>
+        <w:t>Chuẩn hóa định dạng ngày tháng</w:t>
+      </w:r>
+    </w:p>
+    <w:p>
+      <w:pPr>
+        <w:pStyle w:val="ListParagraph"/>
+        <w:numPr>
+          <w:ilvl w:val="0"/>
+          <w:numId w:val="34"/>
+        </w:numPr>
+        <w:rPr>
+          <w:lang w:val="en-US"/>
+        </w:rPr>
+      </w:pPr>
+      <w:r>
+        <w:rPr>
+          <w:lang w:val="en-US"/>
+        </w:rPr>
+        <w:lastRenderedPageBreak/>
+        <w:t>Chuẩn hóa kiểu dữ liệu</w:t>
+      </w:r>
+    </w:p>
+    <w:p>
+      <w:pPr>
+        <w:pStyle w:val="ListParagraph"/>
+        <w:numPr>
+          <w:ilvl w:val="0"/>
+          <w:numId w:val="34"/>
+        </w:numPr>
+        <w:rPr>
+          <w:lang w:val="en-US"/>
+        </w:rPr>
+      </w:pPr>
+      <w:r>
+        <w:rPr>
+          <w:lang w:val="en-US"/>
+        </w:rPr>
+        <w:t>Loại bỏ các cột không cần thiết</w:t>
+      </w:r>
+    </w:p>
+    <w:p>
+      <w:pPr>
+        <w:pStyle w:val="ListParagraph"/>
+        <w:numPr>
+          <w:ilvl w:val="0"/>
+          <w:numId w:val="33"/>
+        </w:numPr>
+        <w:rPr>
+          <w:b/>
+          <w:bCs/>
+          <w:lang w:val="en-US"/>
+        </w:rPr>
+      </w:pPr>
+      <w:r>
+        <w:rPr>
+          <w:b/>
+          <w:bCs/>
+          <w:lang w:val="en-US"/>
+        </w:rPr>
+        <w:t>Load:</w:t>
+      </w:r>
+    </w:p>
+    <w:p>
+      <w:pPr>
+        <w:pStyle w:val="ListParagraph"/>
+        <w:numPr>
+          <w:ilvl w:val="0"/>
+          <w:numId w:val="35"/>
+        </w:numPr>
+        <w:rPr>
+          <w:lang w:val="en-US"/>
+        </w:rPr>
+      </w:pPr>
+      <w:r>
+        <w:rPr>
+          <w:lang w:val="en-US"/>
+        </w:rPr>
+        <w:t>Lưu dữ liệu đã làm sạch vào cơ sở dữ liệu (hoặc file chuẩn hóa)</w:t>
+      </w:r>
+    </w:p>
+    <w:p>
+      <w:pPr>
+        <w:pStyle w:val="ListParagraph"/>
+        <w:numPr>
+          <w:ilvl w:val="0"/>
+          <w:numId w:val="33"/>
+        </w:numPr>
+        <w:rPr>
+          <w:b/>
+          <w:bCs/>
+          <w:lang w:val="en-US"/>
+        </w:rPr>
+      </w:pPr>
+      <w:r>
+        <w:rPr>
+          <w:b/>
+          <w:bCs/>
+          <w:lang w:val="en-US"/>
+        </w:rPr>
+        <w:t>Visualization:</w:t>
+      </w:r>
+    </w:p>
+    <w:p>
+      <w:pPr>
+        <w:pStyle w:val="ListParagraph"/>
+        <w:numPr>
+          <w:ilvl w:val="0"/>
+          <w:numId w:val="35"/>
+        </w:numPr>
+        <w:rPr>
+          <w:lang w:val="en-US"/>
+        </w:rPr>
+      </w:pPr>
+      <w:r>
+        <w:rPr>
+          <w:lang w:val="en-US"/>
+        </w:rPr>
+        <w:t xml:space="preserve">Xây dựng Dashboard trên </w:t>
+      </w:r>
+      <w:r>
+        <w:rPr>
+          <w:lang w:val="en-US"/>
+        </w:rPr>
+        <w:t>Tableau</w:t>
+      </w:r>
+      <w:r>
+        <w:rPr>
+          <w:lang w:val="en-US"/>
+        </w:rPr>
+        <w:t xml:space="preserve"> phục vụ phân tích</w:t>
+      </w:r>
+    </w:p>
+    <w:p>
+      <w:pPr>
         <w:pStyle w:val="ListParagraph"/>
         <w:spacing w:line="360" w:lineRule="auto"/>
         <w:rPr>
@@ -12190,7 +12449,6 @@
                 <w:sz w:val="24"/>
                 <w:szCs w:val="24"/>
               </w:rPr>
-              <w:lastRenderedPageBreak/>
               <w:t>fact_sales</w:t>
             </w:r>
           </w:p>
@@ -12802,247 +13060,8 @@
     </w:p>
     <w:p>
       <w:pPr>
-        <w:rPr>
-          <w:lang w:val="en-US"/>
-        </w:rPr>
-      </w:pPr>
-      <w:r>
-        <w:rPr>
-          <w:lang w:val="en-US"/>
-        </w:rPr>
-        <w:t xml:space="preserve">Quy trình xử lý dữ liệu </w:t>
-      </w:r>
-      <w:r>
-        <w:rPr>
-          <w:b/>
-          <w:bCs/>
-          <w:lang w:val="en-US"/>
-        </w:rPr>
-        <w:t>(Data Pipeline):</w:t>
-      </w:r>
-    </w:p>
-    <w:p>
-      <w:pPr>
         <w:pStyle w:val="ListParagraph"/>
-        <w:numPr>
-          <w:ilvl w:val="0"/>
-          <w:numId w:val="33"/>
-        </w:numPr>
-        <w:rPr>
-          <w:lang w:val="en-US"/>
-        </w:rPr>
-      </w:pPr>
-      <w:r>
-        <w:rPr>
-          <w:b/>
-          <w:bCs/>
-          <w:lang w:val="en-US"/>
-        </w:rPr>
-        <w:t>Extract:</w:t>
-      </w:r>
-      <w:r>
-        <w:rPr>
-          <w:lang w:val="en-US"/>
-        </w:rPr>
-        <w:t xml:space="preserve"> Thu thập dữ liệu từ file CSV Global Superstore.</w:t>
-      </w:r>
-    </w:p>
-    <w:p>
-      <w:pPr>
-        <w:pStyle w:val="ListParagraph"/>
-        <w:numPr>
-          <w:ilvl w:val="0"/>
-          <w:numId w:val="33"/>
-        </w:numPr>
-        <w:rPr>
-          <w:b/>
-          <w:bCs/>
-          <w:lang w:val="en-US"/>
-        </w:rPr>
-      </w:pPr>
-      <w:r>
-        <w:rPr>
-          <w:b/>
-          <w:bCs/>
-          <w:lang w:val="en-US"/>
-        </w:rPr>
-        <w:t>Transform:</w:t>
-      </w:r>
-    </w:p>
-    <w:p>
-      <w:pPr>
-        <w:pStyle w:val="ListParagraph"/>
-        <w:numPr>
-          <w:ilvl w:val="0"/>
-          <w:numId w:val="34"/>
-        </w:numPr>
-        <w:rPr>
-          <w:lang w:val="en-US"/>
-        </w:rPr>
-      </w:pPr>
-      <w:r>
-        <w:rPr>
-          <w:lang w:val="en-US"/>
-        </w:rPr>
-        <w:t>Loại bỏ dữ liệu trùng lặp</w:t>
-      </w:r>
-    </w:p>
-    <w:p>
-      <w:pPr>
-        <w:pStyle w:val="ListParagraph"/>
-        <w:numPr>
-          <w:ilvl w:val="0"/>
-          <w:numId w:val="34"/>
-        </w:numPr>
-        <w:rPr>
-          <w:lang w:val="en-US"/>
-        </w:rPr>
-      </w:pPr>
-      <w:r>
-        <w:rPr>
-          <w:lang w:val="en-US"/>
-        </w:rPr>
-        <w:t>Xử lý giá trị thiếu</w:t>
-      </w:r>
-    </w:p>
-    <w:p>
-      <w:pPr>
-        <w:pStyle w:val="ListParagraph"/>
-        <w:numPr>
-          <w:ilvl w:val="0"/>
-          <w:numId w:val="34"/>
-        </w:numPr>
-        <w:rPr>
-          <w:lang w:val="en-US"/>
-        </w:rPr>
-      </w:pPr>
-      <w:r>
-        <w:rPr>
-          <w:lang w:val="en-US"/>
-        </w:rPr>
-        <w:t>Chuẩn hóa định dạng ngày tháng</w:t>
-      </w:r>
-    </w:p>
-    <w:p>
-      <w:pPr>
-        <w:pStyle w:val="ListParagraph"/>
-        <w:numPr>
-          <w:ilvl w:val="0"/>
-          <w:numId w:val="34"/>
-        </w:numPr>
-        <w:rPr>
-          <w:lang w:val="en-US"/>
-        </w:rPr>
-      </w:pPr>
-      <w:r>
-        <w:rPr>
-          <w:lang w:val="en-US"/>
-        </w:rPr>
-        <w:t>Chuẩn hóa kiểu dữ liệu</w:t>
-      </w:r>
-    </w:p>
-    <w:p>
-      <w:pPr>
-        <w:pStyle w:val="ListParagraph"/>
-        <w:numPr>
-          <w:ilvl w:val="0"/>
-          <w:numId w:val="34"/>
-        </w:numPr>
-        <w:rPr>
-          <w:lang w:val="en-US"/>
-        </w:rPr>
-      </w:pPr>
-      <w:r>
-        <w:rPr>
-          <w:lang w:val="en-US"/>
-        </w:rPr>
-        <w:t>Loại bỏ các cột không cần thiết</w:t>
-      </w:r>
-    </w:p>
-    <w:p>
-      <w:pPr>
-        <w:pStyle w:val="ListParagraph"/>
-        <w:numPr>
-          <w:ilvl w:val="0"/>
-          <w:numId w:val="33"/>
-        </w:numPr>
-        <w:rPr>
-          <w:b/>
-          <w:bCs/>
-          <w:lang w:val="en-US"/>
-        </w:rPr>
-      </w:pPr>
-      <w:r>
-        <w:rPr>
-          <w:b/>
-          <w:bCs/>
-          <w:lang w:val="en-US"/>
-        </w:rPr>
-        <w:t>Load:</w:t>
-      </w:r>
-    </w:p>
-    <w:p>
-      <w:pPr>
-        <w:pStyle w:val="ListParagraph"/>
-        <w:numPr>
-          <w:ilvl w:val="0"/>
-          <w:numId w:val="35"/>
-        </w:numPr>
-        <w:rPr>
-          <w:lang w:val="en-US"/>
-        </w:rPr>
-      </w:pPr>
-      <w:r>
-        <w:rPr>
-          <w:lang w:val="en-US"/>
-        </w:rPr>
-        <w:t>Lưu dữ liệu đã làm sạch vào cơ sở dữ liệu (hoặc file chuẩn hóa)</w:t>
-      </w:r>
-    </w:p>
-    <w:p>
-      <w:pPr>
-        <w:pStyle w:val="ListParagraph"/>
-        <w:numPr>
-          <w:ilvl w:val="0"/>
-          <w:numId w:val="33"/>
-        </w:numPr>
-        <w:rPr>
-          <w:b/>
-          <w:bCs/>
-          <w:lang w:val="en-US"/>
-        </w:rPr>
-      </w:pPr>
-      <w:r>
-        <w:rPr>
-          <w:b/>
-          <w:bCs/>
-          <w:lang w:val="en-US"/>
-        </w:rPr>
-        <w:t>Visualization:</w:t>
-      </w:r>
-    </w:p>
-    <w:p>
-      <w:pPr>
-        <w:pStyle w:val="ListParagraph"/>
-        <w:numPr>
-          <w:ilvl w:val="0"/>
-          <w:numId w:val="35"/>
-        </w:numPr>
-        <w:rPr>
-          <w:lang w:val="en-US"/>
-        </w:rPr>
-      </w:pPr>
-      <w:r>
-        <w:rPr>
-          <w:lang w:val="en-US"/>
-        </w:rPr>
-        <w:t>Xây dựng Dashboard trên Power BI phục vụ phân tích</w:t>
-      </w:r>
-    </w:p>
-    <w:p>
-      <w:pPr>
-        <w:pStyle w:val="ListParagraph"/>
-        <w:ind w:left="0"/>
+        <w:ind w:left="432"/>
         <w:rPr>
           <w:lang w:val="en-US"/>
         </w:rPr>
@@ -13135,6 +13154,7 @@
           <w:bCs/>
           <w:lang w:val="en-US"/>
         </w:rPr>
+        <w:lastRenderedPageBreak/>
         <w:t>Chương 1: Giới thiệu đề tài</w:t>
       </w:r>
     </w:p>
@@ -13153,7 +13173,6 @@
           <w:szCs w:val="24"/>
           <w:lang w:val="en-US"/>
         </w:rPr>
-        <w:lastRenderedPageBreak/>
         <w:t>Chương này trình bày tổng quan về dự án phân tích dữ liệu bán lẻ dựa trên bộ dữ liệu Global Superstore.</w:t>
       </w:r>
     </w:p>
@@ -13524,6 +13543,7 @@
           <w:szCs w:val="24"/>
           <w:lang w:val="en-US"/>
         </w:rPr>
+        <w:lastRenderedPageBreak/>
         <w:t>2. Xây dựng Data Story</w:t>
       </w:r>
     </w:p>
@@ -13542,7 +13562,6 @@
           <w:szCs w:val="24"/>
           <w:lang w:val="en-US"/>
         </w:rPr>
-        <w:lastRenderedPageBreak/>
         <w:t>Tập trung vào các vấn đề cốt lõi:</w:t>
       </w:r>
     </w:p>
@@ -13961,6 +13980,7 @@
           <w:szCs w:val="24"/>
           <w:lang w:val="en-US"/>
         </w:rPr>
+        <w:lastRenderedPageBreak/>
         <w:t>config.py</w:t>
       </w:r>
       <w:r>
@@ -13992,7 +14012,6 @@
           <w:szCs w:val="24"/>
           <w:lang w:val="en-US"/>
         </w:rPr>
-        <w:lastRenderedPageBreak/>
         <w:t>eda.py</w:t>
       </w:r>
       <w:r>
@@ -14406,6 +14425,7 @@
           <w:szCs w:val="24"/>
           <w:lang w:val="en-US"/>
         </w:rPr>
+        <w:lastRenderedPageBreak/>
         <w:t>Monthly Performance</w:t>
       </w:r>
     </w:p>
@@ -14446,7 +14466,6 @@
           <w:szCs w:val="24"/>
           <w:lang w:val="en-US"/>
         </w:rPr>
-        <w:lastRenderedPageBreak/>
         <w:t>Executive Overview Dashboard</w:t>
       </w:r>
     </w:p>
@@ -14865,6 +14884,7 @@
           <w:szCs w:val="24"/>
           <w:lang w:val="en-US"/>
         </w:rPr>
+        <w:lastRenderedPageBreak/>
         <w:t>RFM được tính bằng Python thay vì Tableau để giảm tải hệ thống</w:t>
       </w:r>
     </w:p>
@@ -14905,7 +14925,6 @@
           <w:szCs w:val="24"/>
           <w:lang w:val="en-US"/>
         </w:rPr>
-        <w:lastRenderedPageBreak/>
         <w:t>Dashboard load tức thời</w:t>
       </w:r>
     </w:p>
@@ -15300,6 +15319,7 @@
           <w:sz w:val="24"/>
           <w:szCs w:val="24"/>
         </w:rPr>
+        <w:lastRenderedPageBreak/>
         <w:t>LẬP</w:t>
       </w:r>
       <w:r>
@@ -15646,7 +15666,6 @@
                 <w:szCs w:val="24"/>
                 <w:lang w:val="en-US"/>
               </w:rPr>
-              <w:lastRenderedPageBreak/>
               <w:t>1.1</w:t>
             </w:r>
           </w:p>
@@ -18384,6 +18403,7 @@
                 <w:szCs w:val="24"/>
                 <w:lang w:val="en-US"/>
               </w:rPr>
+              <w:lastRenderedPageBreak/>
               <w:t>4.3</w:t>
             </w:r>
           </w:p>
@@ -21148,6 +21168,7 @@
           <w:sz w:val="24"/>
           <w:szCs w:val="24"/>
         </w:rPr>
+        <w:lastRenderedPageBreak/>
         <w:t>Dữ liệu raw (bất khả xâm phạm).</w:t>
       </w:r>
     </w:p>
@@ -21207,7 +21228,6 @@
           <w:sz w:val="24"/>
           <w:szCs w:val="24"/>
         </w:rPr>
-        <w:lastRenderedPageBreak/>
         <w:t>c) Công nghệ &amp; Quyết định công nghệ:</w:t>
       </w:r>
     </w:p>
@@ -21532,6 +21552,7 @@
           <w:b/>
           <w:bCs/>
         </w:rPr>
+        <w:lastRenderedPageBreak/>
         <w:t>Layer 3 - Transformation &amp; Engineering:</w:t>
       </w:r>
       <w:r>
@@ -21559,7 +21580,6 @@
           <w:b/>
           <w:bCs/>
         </w:rPr>
-        <w:lastRenderedPageBreak/>
         <w:t>Layer 4 - Modeling:</w:t>
       </w:r>
       <w:r>
@@ -22208,6 +22228,7 @@
           <w:sz w:val="24"/>
           <w:szCs w:val="24"/>
         </w:rPr>
+        <w:lastRenderedPageBreak/>
         <w:t>Dữ liệu được phân chia thành 5 nhóm như sau:</w:t>
       </w:r>
     </w:p>
@@ -22263,7 +22284,6 @@
                 <w:sz w:val="24"/>
                 <w:szCs w:val="24"/>
               </w:rPr>
-              <w:lastRenderedPageBreak/>
               <w:t>STT</w:t>
             </w:r>
           </w:p>
@@ -24633,6 +24653,7 @@
                 <w:sz w:val="24"/>
                 <w:szCs w:val="24"/>
               </w:rPr>
+              <w:lastRenderedPageBreak/>
               <w:t>27</w:t>
             </w:r>
           </w:p>
@@ -24900,7 +24921,6 @@
                 <w:sz w:val="24"/>
                 <w:szCs w:val="24"/>
               </w:rPr>
-              <w:lastRenderedPageBreak/>
               <w:t>30</w:t>
             </w:r>
           </w:p>
@@ -31309,6 +31329,7 @@
   <w:style w:type="character" w:default="1" w:styleId="DefaultParagraphFont">
     <w:name w:val="Default Paragraph Font"/>
     <w:uiPriority w:val="1"/>
+    <w:semiHidden/>
     <w:unhideWhenUsed/>
   </w:style>
   <w:style w:type="table" w:default="1" w:styleId="TableNormal">
@@ -32436,28 +32457,28 @@
 </file>
 
 <file path=customXml/item1.xml><?xml version="1.0" encoding="utf-8"?>
-<b:Sources xmlns:b="http://schemas.openxmlformats.org/officeDocument/2006/bibliography" xmlns="http://schemas.openxmlformats.org/officeDocument/2006/bibliography" SelectedStyle="\APASixthEditionOfficeOnline.xsl" StyleName="APA" Version="6"/>
-</file>
-
-<file path=customXml/item2.xml><?xml version="1.0" encoding="utf-8"?>
 <go:gDocsCustomXmlDataStorage xmlns:go="http://customooxmlschemas.google.com/" xmlns:r="http://schemas.openxmlformats.org/officeDocument/2006/relationships" uri="GoogleDocsCustomDataVersion2">
   <go:docsCustomData xmlns:go="http://customooxmlschemas.google.com/" roundtripDataSignature="AMtx7mgiPnSzeFcphxz7x95siPLEGky12A==">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</go:docsCustomData>
 </go:gDocsCustomXmlDataStorage>
 </file>
 
-<file path=customXml/itemProps1.xml><?xml version="1.0" encoding="utf-8"?>
-<ds:datastoreItem xmlns:ds="http://schemas.openxmlformats.org/officeDocument/2006/customXml" ds:itemID="{6BA7E6F1-37ED-4F0B-9095-9991D41BCB91}">
-  <ds:schemaRefs>
-    <ds:schemaRef ds:uri="http://schemas.openxmlformats.org/officeDocument/2006/bibliography"/>
-  </ds:schemaRefs>
-</ds:datastoreItem>
+<file path=customXml/item2.xml><?xml version="1.0" encoding="utf-8"?>
+<b:Sources xmlns:b="http://schemas.openxmlformats.org/officeDocument/2006/bibliography" xmlns="http://schemas.openxmlformats.org/officeDocument/2006/bibliography" SelectedStyle="\APASixthEditionOfficeOnline.xsl" StyleName="APA" Version="6"/>
 </file>
 
-<file path=customXml/itemProps2.xml><?xml version="1.0" encoding="utf-8"?>
+<file path=customXml/itemProps1.xml><?xml version="1.0" encoding="utf-8"?>
 <ds:datastoreItem xmlns:ds="http://schemas.openxmlformats.org/officeDocument/2006/customXml" ds:itemID="{11111111-1234-1234-1234-123412341234}">
   <ds:schemaRefs>
     <ds:schemaRef ds:uri="http://customooxmlschemas.google.com/"/>
     <ds:schemaRef ds:uri="http://schemas.openxmlformats.org/officeDocument/2006/relationships"/>
   </ds:schemaRefs>
 </ds:datastoreItem>
+</file>
+
+<file path=customXml/itemProps2.xml><?xml version="1.0" encoding="utf-8"?>
+<ds:datastoreItem xmlns:ds="http://schemas.openxmlformats.org/officeDocument/2006/customXml" ds:itemID="{6BA7E6F1-37ED-4F0B-9095-9991D41BCB91}">
+  <ds:schemaRefs>
+    <ds:schemaRef ds:uri="http://schemas.openxmlformats.org/officeDocument/2006/bibliography"/>
+  </ds:schemaRefs>
+</ds:datastoreItem>
 </file>
</xml_diff>

<commit_message>
bổ sung Hệ thống chỉ số đo lường hiệu quả 2.4.2
</commit_message>
<xml_diff>
--- a/Báo cáo chính.docx
+++ b/Báo cáo chính.docx
@@ -25799,6 +25799,1272 @@
       </w:r>
       <w:bookmarkEnd w:id="8"/>
     </w:p>
+    <w:p>
+      <w:pPr>
+        <w:pStyle w:val="ListParagraph"/>
+        <w:numPr>
+          <w:ilvl w:val="2"/>
+          <w:numId w:val="4"/>
+        </w:numPr>
+        <w:rPr>
+          <w:b/>
+          <w:bCs/>
+          <w:color w:val="EE0000"/>
+          <w:lang w:val="vi-VN"/>
+        </w:rPr>
+      </w:pPr>
+      <w:r>
+        <w:rPr>
+          <w:b/>
+          <w:bCs/>
+          <w:color w:val="EE0000"/>
+        </w:rPr>
+        <w:lastRenderedPageBreak/>
+        <w:t>HỆ</w:t>
+      </w:r>
+      <w:r>
+        <w:rPr>
+          <w:b/>
+          <w:bCs/>
+          <w:color w:val="EE0000"/>
+          <w:lang w:val="vi-VN"/>
+        </w:rPr>
+        <w:t xml:space="preserve"> THỐNG ĐO LƯỜNG CHỈ SỐ HIỆU QUẢ </w:t>
+      </w:r>
+      <w:r>
+        <w:rPr>
+          <w:b/>
+          <w:bCs/>
+          <w:color w:val="EE0000"/>
+        </w:rPr>
+        <w:t>(KPI Framework)</w:t>
+      </w:r>
+    </w:p>
+    <w:p>
+      <w:pPr>
+        <w:rPr>
+          <w:color w:val="000000" w:themeColor="text1"/>
+          <w:sz w:val="24"/>
+          <w:szCs w:val="24"/>
+          <w:lang w:val="vi-VN"/>
+        </w:rPr>
+      </w:pPr>
+      <w:r>
+        <w:rPr>
+          <w:color w:val="000000" w:themeColor="text1"/>
+          <w:sz w:val="24"/>
+          <w:szCs w:val="24"/>
+        </w:rPr>
+        <w:t>Dự án sử dụng hệ thống KPI nhằm đo lường sức khỏe tài chính và hiệu quả vận hành của doanh nghiệp bán lẻ.</w:t>
+      </w:r>
+    </w:p>
+    <w:p>
+      <w:pPr>
+        <w:pStyle w:val="ListParagraph"/>
+        <w:numPr>
+          <w:ilvl w:val="0"/>
+          <w:numId w:val="36"/>
+        </w:numPr>
+        <w:rPr>
+          <w:b/>
+          <w:bCs/>
+          <w:color w:val="000000" w:themeColor="text1"/>
+          <w:sz w:val="24"/>
+          <w:szCs w:val="24"/>
+          <w:lang w:val="vi-VN"/>
+        </w:rPr>
+      </w:pPr>
+      <w:r>
+        <w:rPr>
+          <w:b/>
+          <w:bCs/>
+          <w:color w:val="000000" w:themeColor="text1"/>
+          <w:sz w:val="24"/>
+          <w:szCs w:val="24"/>
+        </w:rPr>
+        <w:t>Nhóm KPI tài chính (Financial KPIs)</w:t>
+      </w:r>
+    </w:p>
+    <w:tbl>
+      <w:tblPr>
+        <w:tblW w:w="0" w:type="auto"/>
+        <w:tblCellSpacing w:w="15" w:type="dxa"/>
+        <w:tblCellMar>
+          <w:top w:w="15" w:type="dxa"/>
+          <w:left w:w="15" w:type="dxa"/>
+          <w:bottom w:w="15" w:type="dxa"/>
+          <w:right w:w="15" w:type="dxa"/>
+        </w:tblCellMar>
+        <w:tblLook w:val="04A0" w:firstRow="1" w:lastRow="0" w:firstColumn="1" w:lastColumn="0" w:noHBand="0" w:noVBand="1"/>
+      </w:tblPr>
+      <w:tblGrid>
+        <w:gridCol w:w="2285"/>
+        <w:gridCol w:w="3993"/>
+        <w:gridCol w:w="3082"/>
+      </w:tblGrid>
+      <w:tr>
+        <w:trPr>
+          <w:tblHeader/>
+          <w:tblCellSpacing w:w="15" w:type="dxa"/>
+        </w:trPr>
+        <w:tc>
+          <w:tcPr>
+            <w:tcW w:w="0" w:type="auto"/>
+            <w:vAlign w:val="center"/>
+            <w:hideMark/>
+          </w:tcPr>
+          <w:p>
+            <w:pPr>
+              <w:rPr>
+                <w:b/>
+                <w:bCs/>
+                <w:color w:val="000000" w:themeColor="text1"/>
+                <w:sz w:val="24"/>
+                <w:szCs w:val="24"/>
+                <w:lang w:val="en-US"/>
+              </w:rPr>
+            </w:pPr>
+            <w:r>
+              <w:rPr>
+                <w:b/>
+                <w:bCs/>
+                <w:color w:val="000000" w:themeColor="text1"/>
+                <w:sz w:val="24"/>
+                <w:szCs w:val="24"/>
+                <w:lang w:val="en-US"/>
+              </w:rPr>
+              <w:t>KPI</w:t>
+            </w:r>
+          </w:p>
+        </w:tc>
+        <w:tc>
+          <w:tcPr>
+            <w:tcW w:w="0" w:type="auto"/>
+            <w:vAlign w:val="center"/>
+            <w:hideMark/>
+          </w:tcPr>
+          <w:p>
+            <w:pPr>
+              <w:rPr>
+                <w:b/>
+                <w:bCs/>
+                <w:color w:val="000000" w:themeColor="text1"/>
+                <w:sz w:val="24"/>
+                <w:szCs w:val="24"/>
+                <w:lang w:val="en-US"/>
+              </w:rPr>
+            </w:pPr>
+            <w:r>
+              <w:rPr>
+                <w:b/>
+                <w:bCs/>
+                <w:color w:val="000000" w:themeColor="text1"/>
+                <w:sz w:val="24"/>
+                <w:szCs w:val="24"/>
+                <w:lang w:val="en-US"/>
+              </w:rPr>
+              <w:t>Công thức</w:t>
+            </w:r>
+          </w:p>
+        </w:tc>
+        <w:tc>
+          <w:tcPr>
+            <w:tcW w:w="0" w:type="auto"/>
+            <w:vAlign w:val="center"/>
+            <w:hideMark/>
+          </w:tcPr>
+          <w:p>
+            <w:pPr>
+              <w:rPr>
+                <w:b/>
+                <w:bCs/>
+                <w:color w:val="000000" w:themeColor="text1"/>
+                <w:sz w:val="24"/>
+                <w:szCs w:val="24"/>
+                <w:lang w:val="en-US"/>
+              </w:rPr>
+            </w:pPr>
+            <w:r>
+              <w:rPr>
+                <w:b/>
+                <w:bCs/>
+                <w:color w:val="000000" w:themeColor="text1"/>
+                <w:sz w:val="24"/>
+                <w:szCs w:val="24"/>
+                <w:lang w:val="en-US"/>
+              </w:rPr>
+              <w:t>Ý nghĩa</w:t>
+            </w:r>
+          </w:p>
+        </w:tc>
+      </w:tr>
+      <w:tr>
+        <w:trPr>
+          <w:tblCellSpacing w:w="15" w:type="dxa"/>
+        </w:trPr>
+        <w:tc>
+          <w:tcPr>
+            <w:tcW w:w="0" w:type="auto"/>
+            <w:vAlign w:val="center"/>
+            <w:hideMark/>
+          </w:tcPr>
+          <w:p>
+            <w:pPr>
+              <w:rPr>
+                <w:color w:val="000000" w:themeColor="text1"/>
+                <w:sz w:val="24"/>
+                <w:szCs w:val="24"/>
+                <w:lang w:val="en-US"/>
+              </w:rPr>
+            </w:pPr>
+            <w:r>
+              <w:rPr>
+                <w:color w:val="000000" w:themeColor="text1"/>
+                <w:sz w:val="24"/>
+                <w:szCs w:val="24"/>
+                <w:lang w:val="en-US"/>
+              </w:rPr>
+              <w:t>Total Revenue</w:t>
+            </w:r>
+          </w:p>
+        </w:tc>
+        <w:tc>
+          <w:tcPr>
+            <w:tcW w:w="0" w:type="auto"/>
+            <w:vAlign w:val="center"/>
+            <w:hideMark/>
+          </w:tcPr>
+          <w:p>
+            <w:pPr>
+              <w:rPr>
+                <w:color w:val="000000" w:themeColor="text1"/>
+                <w:sz w:val="24"/>
+                <w:szCs w:val="24"/>
+                <w:lang w:val="en-US"/>
+              </w:rPr>
+            </w:pPr>
+            <w:r>
+              <w:rPr>
+                <w:color w:val="000000" w:themeColor="text1"/>
+                <w:sz w:val="24"/>
+                <w:szCs w:val="24"/>
+                <w:lang w:val="en-US"/>
+              </w:rPr>
+              <w:t>SUM(Sales)</w:t>
+            </w:r>
+          </w:p>
+        </w:tc>
+        <w:tc>
+          <w:tcPr>
+            <w:tcW w:w="0" w:type="auto"/>
+            <w:vAlign w:val="center"/>
+            <w:hideMark/>
+          </w:tcPr>
+          <w:p>
+            <w:pPr>
+              <w:rPr>
+                <w:color w:val="000000" w:themeColor="text1"/>
+                <w:sz w:val="24"/>
+                <w:szCs w:val="24"/>
+                <w:lang w:val="en-US"/>
+              </w:rPr>
+            </w:pPr>
+            <w:r>
+              <w:rPr>
+                <w:color w:val="000000" w:themeColor="text1"/>
+                <w:sz w:val="24"/>
+                <w:szCs w:val="24"/>
+                <w:lang w:val="en-US"/>
+              </w:rPr>
+              <w:t>Tổng doanh thu toàn hệ thống</w:t>
+            </w:r>
+          </w:p>
+        </w:tc>
+      </w:tr>
+      <w:tr>
+        <w:trPr>
+          <w:tblCellSpacing w:w="15" w:type="dxa"/>
+        </w:trPr>
+        <w:tc>
+          <w:tcPr>
+            <w:tcW w:w="0" w:type="auto"/>
+            <w:vAlign w:val="center"/>
+            <w:hideMark/>
+          </w:tcPr>
+          <w:p>
+            <w:pPr>
+              <w:rPr>
+                <w:color w:val="000000" w:themeColor="text1"/>
+                <w:sz w:val="24"/>
+                <w:szCs w:val="24"/>
+                <w:lang w:val="en-US"/>
+              </w:rPr>
+            </w:pPr>
+            <w:r>
+              <w:rPr>
+                <w:color w:val="000000" w:themeColor="text1"/>
+                <w:sz w:val="24"/>
+                <w:szCs w:val="24"/>
+                <w:lang w:val="en-US"/>
+              </w:rPr>
+              <w:t>Total Profit</w:t>
+            </w:r>
+          </w:p>
+        </w:tc>
+        <w:tc>
+          <w:tcPr>
+            <w:tcW w:w="0" w:type="auto"/>
+            <w:vAlign w:val="center"/>
+            <w:hideMark/>
+          </w:tcPr>
+          <w:p>
+            <w:pPr>
+              <w:rPr>
+                <w:color w:val="000000" w:themeColor="text1"/>
+                <w:sz w:val="24"/>
+                <w:szCs w:val="24"/>
+                <w:lang w:val="en-US"/>
+              </w:rPr>
+            </w:pPr>
+            <w:r>
+              <w:rPr>
+                <w:color w:val="000000" w:themeColor="text1"/>
+                <w:sz w:val="24"/>
+                <w:szCs w:val="24"/>
+                <w:lang w:val="en-US"/>
+              </w:rPr>
+              <w:t>SUM(Profit)</w:t>
+            </w:r>
+          </w:p>
+        </w:tc>
+        <w:tc>
+          <w:tcPr>
+            <w:tcW w:w="0" w:type="auto"/>
+            <w:vAlign w:val="center"/>
+            <w:hideMark/>
+          </w:tcPr>
+          <w:p>
+            <w:pPr>
+              <w:rPr>
+                <w:color w:val="000000" w:themeColor="text1"/>
+                <w:sz w:val="24"/>
+                <w:szCs w:val="24"/>
+                <w:lang w:val="en-US"/>
+              </w:rPr>
+            </w:pPr>
+            <w:r>
+              <w:rPr>
+                <w:color w:val="000000" w:themeColor="text1"/>
+                <w:sz w:val="24"/>
+                <w:szCs w:val="24"/>
+                <w:lang w:val="en-US"/>
+              </w:rPr>
+              <w:t>Tổng lợi nhuận thực tế</w:t>
+            </w:r>
+          </w:p>
+        </w:tc>
+      </w:tr>
+      <w:tr>
+        <w:trPr>
+          <w:tblCellSpacing w:w="15" w:type="dxa"/>
+        </w:trPr>
+        <w:tc>
+          <w:tcPr>
+            <w:tcW w:w="0" w:type="auto"/>
+            <w:vAlign w:val="center"/>
+            <w:hideMark/>
+          </w:tcPr>
+          <w:p>
+            <w:pPr>
+              <w:rPr>
+                <w:color w:val="000000" w:themeColor="text1"/>
+                <w:sz w:val="24"/>
+                <w:szCs w:val="24"/>
+                <w:lang w:val="en-US"/>
+              </w:rPr>
+            </w:pPr>
+            <w:r>
+              <w:rPr>
+                <w:color w:val="000000" w:themeColor="text1"/>
+                <w:sz w:val="24"/>
+                <w:szCs w:val="24"/>
+                <w:lang w:val="en-US"/>
+              </w:rPr>
+              <w:t>Profit Margin (%)</w:t>
+            </w:r>
+          </w:p>
+        </w:tc>
+        <w:tc>
+          <w:tcPr>
+            <w:tcW w:w="0" w:type="auto"/>
+            <w:vAlign w:val="center"/>
+            <w:hideMark/>
+          </w:tcPr>
+          <w:p>
+            <w:pPr>
+              <w:rPr>
+                <w:color w:val="000000" w:themeColor="text1"/>
+                <w:sz w:val="24"/>
+                <w:szCs w:val="24"/>
+                <w:lang w:val="en-US"/>
+              </w:rPr>
+            </w:pPr>
+            <w:r>
+              <w:rPr>
+                <w:color w:val="000000" w:themeColor="text1"/>
+                <w:sz w:val="24"/>
+                <w:szCs w:val="24"/>
+                <w:lang w:val="en-US"/>
+              </w:rPr>
+              <w:t>Profit / Sales</w:t>
+            </w:r>
+          </w:p>
+        </w:tc>
+        <w:tc>
+          <w:tcPr>
+            <w:tcW w:w="0" w:type="auto"/>
+            <w:vAlign w:val="center"/>
+            <w:hideMark/>
+          </w:tcPr>
+          <w:p>
+            <w:pPr>
+              <w:rPr>
+                <w:color w:val="000000" w:themeColor="text1"/>
+                <w:sz w:val="24"/>
+                <w:szCs w:val="24"/>
+                <w:lang w:val="en-US"/>
+              </w:rPr>
+            </w:pPr>
+            <w:r>
+              <w:rPr>
+                <w:color w:val="000000" w:themeColor="text1"/>
+                <w:sz w:val="24"/>
+                <w:szCs w:val="24"/>
+                <w:lang w:val="en-US"/>
+              </w:rPr>
+              <w:t>Đánh giá hiệu quả kinh doanh</w:t>
+            </w:r>
+          </w:p>
+        </w:tc>
+      </w:tr>
+      <w:tr>
+        <w:trPr>
+          <w:tblCellSpacing w:w="15" w:type="dxa"/>
+        </w:trPr>
+        <w:tc>
+          <w:tcPr>
+            <w:tcW w:w="0" w:type="auto"/>
+            <w:vAlign w:val="center"/>
+            <w:hideMark/>
+          </w:tcPr>
+          <w:p>
+            <w:pPr>
+              <w:rPr>
+                <w:color w:val="000000" w:themeColor="text1"/>
+                <w:sz w:val="24"/>
+                <w:szCs w:val="24"/>
+                <w:lang w:val="en-US"/>
+              </w:rPr>
+            </w:pPr>
+            <w:r>
+              <w:rPr>
+                <w:color w:val="000000" w:themeColor="text1"/>
+                <w:sz w:val="24"/>
+                <w:szCs w:val="24"/>
+                <w:lang w:val="en-US"/>
+              </w:rPr>
+              <w:t>Average Discount Rate</w:t>
+            </w:r>
+          </w:p>
+        </w:tc>
+        <w:tc>
+          <w:tcPr>
+            <w:tcW w:w="0" w:type="auto"/>
+            <w:vAlign w:val="center"/>
+            <w:hideMark/>
+          </w:tcPr>
+          <w:p>
+            <w:pPr>
+              <w:rPr>
+                <w:color w:val="000000" w:themeColor="text1"/>
+                <w:sz w:val="24"/>
+                <w:szCs w:val="24"/>
+                <w:lang w:val="en-US"/>
+              </w:rPr>
+            </w:pPr>
+            <w:r>
+              <w:rPr>
+                <w:color w:val="000000" w:themeColor="text1"/>
+                <w:sz w:val="24"/>
+                <w:szCs w:val="24"/>
+                <w:lang w:val="en-US"/>
+              </w:rPr>
+              <w:t>AVG(Discount)</w:t>
+            </w:r>
+          </w:p>
+        </w:tc>
+        <w:tc>
+          <w:tcPr>
+            <w:tcW w:w="0" w:type="auto"/>
+            <w:vAlign w:val="center"/>
+            <w:hideMark/>
+          </w:tcPr>
+          <w:p>
+            <w:pPr>
+              <w:rPr>
+                <w:color w:val="000000" w:themeColor="text1"/>
+                <w:sz w:val="24"/>
+                <w:szCs w:val="24"/>
+                <w:lang w:val="en-US"/>
+              </w:rPr>
+            </w:pPr>
+            <w:r>
+              <w:rPr>
+                <w:color w:val="000000" w:themeColor="text1"/>
+                <w:sz w:val="24"/>
+                <w:szCs w:val="24"/>
+                <w:lang w:val="en-US"/>
+              </w:rPr>
+              <w:t>Mức độ phụ thuộc vào giảm giá</w:t>
+            </w:r>
+          </w:p>
+        </w:tc>
+      </w:tr>
+      <w:tr>
+        <w:trPr>
+          <w:tblCellSpacing w:w="15" w:type="dxa"/>
+        </w:trPr>
+        <w:tc>
+          <w:tcPr>
+            <w:tcW w:w="0" w:type="auto"/>
+            <w:vAlign w:val="center"/>
+            <w:hideMark/>
+          </w:tcPr>
+          <w:p>
+            <w:pPr>
+              <w:rPr>
+                <w:color w:val="000000" w:themeColor="text1"/>
+                <w:sz w:val="24"/>
+                <w:szCs w:val="24"/>
+                <w:lang w:val="en-US"/>
+              </w:rPr>
+            </w:pPr>
+            <w:r>
+              <w:rPr>
+                <w:color w:val="000000" w:themeColor="text1"/>
+                <w:sz w:val="24"/>
+                <w:szCs w:val="24"/>
+                <w:lang w:val="en-US"/>
+              </w:rPr>
+              <w:t>Loss Order Rate</w:t>
+            </w:r>
+          </w:p>
+        </w:tc>
+        <w:tc>
+          <w:tcPr>
+            <w:tcW w:w="0" w:type="auto"/>
+            <w:vAlign w:val="center"/>
+            <w:hideMark/>
+          </w:tcPr>
+          <w:p>
+            <w:pPr>
+              <w:rPr>
+                <w:color w:val="000000" w:themeColor="text1"/>
+                <w:sz w:val="24"/>
+                <w:szCs w:val="24"/>
+                <w:lang w:val="en-US"/>
+              </w:rPr>
+            </w:pPr>
+            <w:r>
+              <w:rPr>
+                <w:color w:val="000000" w:themeColor="text1"/>
+                <w:sz w:val="24"/>
+                <w:szCs w:val="24"/>
+                <w:lang w:val="en-US"/>
+              </w:rPr>
+              <w:t>COUNT(is_loss_maker=1)/ Total Orders</w:t>
+            </w:r>
+          </w:p>
+        </w:tc>
+        <w:tc>
+          <w:tcPr>
+            <w:tcW w:w="0" w:type="auto"/>
+            <w:vAlign w:val="center"/>
+            <w:hideMark/>
+          </w:tcPr>
+          <w:p>
+            <w:pPr>
+              <w:rPr>
+                <w:color w:val="000000" w:themeColor="text1"/>
+                <w:sz w:val="24"/>
+                <w:szCs w:val="24"/>
+                <w:lang w:val="en-US"/>
+              </w:rPr>
+            </w:pPr>
+            <w:r>
+              <w:rPr>
+                <w:color w:val="000000" w:themeColor="text1"/>
+                <w:sz w:val="24"/>
+                <w:szCs w:val="24"/>
+                <w:lang w:val="en-US"/>
+              </w:rPr>
+              <w:t>Tỷ lệ đơn hàng gây lỗ</w:t>
+            </w:r>
+          </w:p>
+        </w:tc>
+      </w:tr>
+    </w:tbl>
+    <w:p>
+      <w:pPr>
+        <w:rPr>
+          <w:color w:val="000000" w:themeColor="text1"/>
+          <w:sz w:val="24"/>
+          <w:szCs w:val="24"/>
+          <w:lang w:val="vi-VN"/>
+        </w:rPr>
+      </w:pPr>
+    </w:p>
+    <w:p>
+      <w:pPr>
+        <w:pStyle w:val="ListParagraph"/>
+        <w:numPr>
+          <w:ilvl w:val="0"/>
+          <w:numId w:val="36"/>
+        </w:numPr>
+        <w:rPr>
+          <w:b/>
+          <w:bCs/>
+          <w:color w:val="000000" w:themeColor="text1"/>
+          <w:sz w:val="24"/>
+          <w:szCs w:val="24"/>
+          <w:lang w:val="vi-VN"/>
+        </w:rPr>
+      </w:pPr>
+      <w:r>
+        <w:rPr>
+          <w:b/>
+          <w:bCs/>
+          <w:color w:val="000000" w:themeColor="text1"/>
+          <w:sz w:val="24"/>
+          <w:szCs w:val="24"/>
+        </w:rPr>
+        <w:t>Nhóm KPI khách hàng (Customer KPIs)</w:t>
+      </w:r>
+    </w:p>
+    <w:tbl>
+      <w:tblPr>
+        <w:tblW w:w="0" w:type="auto"/>
+        <w:tblCellSpacing w:w="15" w:type="dxa"/>
+        <w:tblCellMar>
+          <w:top w:w="15" w:type="dxa"/>
+          <w:left w:w="15" w:type="dxa"/>
+          <w:bottom w:w="15" w:type="dxa"/>
+          <w:right w:w="15" w:type="dxa"/>
+        </w:tblCellMar>
+        <w:tblLook w:val="04A0" w:firstRow="1" w:lastRow="0" w:firstColumn="1" w:lastColumn="0" w:noHBand="0" w:noVBand="1"/>
+      </w:tblPr>
+      <w:tblGrid>
+        <w:gridCol w:w="1909"/>
+        <w:gridCol w:w="4328"/>
+      </w:tblGrid>
+      <w:tr>
+        <w:trPr>
+          <w:tblHeader/>
+          <w:tblCellSpacing w:w="15" w:type="dxa"/>
+        </w:trPr>
+        <w:tc>
+          <w:tcPr>
+            <w:tcW w:w="0" w:type="auto"/>
+            <w:vAlign w:val="center"/>
+            <w:hideMark/>
+          </w:tcPr>
+          <w:p>
+            <w:pPr>
+              <w:rPr>
+                <w:b/>
+                <w:bCs/>
+                <w:color w:val="000000" w:themeColor="text1"/>
+                <w:sz w:val="24"/>
+                <w:szCs w:val="24"/>
+                <w:lang w:val="en-US"/>
+              </w:rPr>
+            </w:pPr>
+            <w:r>
+              <w:rPr>
+                <w:b/>
+                <w:bCs/>
+                <w:color w:val="000000" w:themeColor="text1"/>
+                <w:sz w:val="24"/>
+                <w:szCs w:val="24"/>
+                <w:lang w:val="en-US"/>
+              </w:rPr>
+              <w:t>KPI</w:t>
+            </w:r>
+          </w:p>
+        </w:tc>
+        <w:tc>
+          <w:tcPr>
+            <w:tcW w:w="4283" w:type="dxa"/>
+            <w:vAlign w:val="center"/>
+            <w:hideMark/>
+          </w:tcPr>
+          <w:p>
+            <w:pPr>
+              <w:rPr>
+                <w:b/>
+                <w:bCs/>
+                <w:color w:val="000000" w:themeColor="text1"/>
+                <w:sz w:val="24"/>
+                <w:szCs w:val="24"/>
+                <w:lang w:val="en-US"/>
+              </w:rPr>
+            </w:pPr>
+            <w:r>
+              <w:rPr>
+                <w:b/>
+                <w:bCs/>
+                <w:color w:val="000000" w:themeColor="text1"/>
+                <w:sz w:val="24"/>
+                <w:szCs w:val="24"/>
+                <w:lang w:val="en-US"/>
+              </w:rPr>
+              <w:t>Mô tả</w:t>
+            </w:r>
+          </w:p>
+        </w:tc>
+      </w:tr>
+      <w:tr>
+        <w:trPr>
+          <w:tblCellSpacing w:w="15" w:type="dxa"/>
+        </w:trPr>
+        <w:tc>
+          <w:tcPr>
+            <w:tcW w:w="0" w:type="auto"/>
+            <w:vAlign w:val="center"/>
+            <w:hideMark/>
+          </w:tcPr>
+          <w:p>
+            <w:pPr>
+              <w:rPr>
+                <w:color w:val="000000" w:themeColor="text1"/>
+                <w:sz w:val="24"/>
+                <w:szCs w:val="24"/>
+                <w:lang w:val="en-US"/>
+              </w:rPr>
+            </w:pPr>
+            <w:r>
+              <w:rPr>
+                <w:color w:val="000000" w:themeColor="text1"/>
+                <w:sz w:val="24"/>
+                <w:szCs w:val="24"/>
+                <w:lang w:val="en-US"/>
+              </w:rPr>
+              <w:t>Recency</w:t>
+            </w:r>
+          </w:p>
+        </w:tc>
+        <w:tc>
+          <w:tcPr>
+            <w:tcW w:w="4283" w:type="dxa"/>
+            <w:vAlign w:val="center"/>
+            <w:hideMark/>
+          </w:tcPr>
+          <w:p>
+            <w:pPr>
+              <w:rPr>
+                <w:color w:val="000000" w:themeColor="text1"/>
+                <w:sz w:val="24"/>
+                <w:szCs w:val="24"/>
+                <w:lang w:val="en-US"/>
+              </w:rPr>
+            </w:pPr>
+            <w:r>
+              <w:rPr>
+                <w:color w:val="000000" w:themeColor="text1"/>
+                <w:sz w:val="24"/>
+                <w:szCs w:val="24"/>
+                <w:lang w:val="en-US"/>
+              </w:rPr>
+              <w:t>Số ngày kể từ lần mua gần nhất</w:t>
+            </w:r>
+          </w:p>
+        </w:tc>
+      </w:tr>
+      <w:tr>
+        <w:trPr>
+          <w:tblCellSpacing w:w="15" w:type="dxa"/>
+        </w:trPr>
+        <w:tc>
+          <w:tcPr>
+            <w:tcW w:w="0" w:type="auto"/>
+            <w:vAlign w:val="center"/>
+            <w:hideMark/>
+          </w:tcPr>
+          <w:p>
+            <w:pPr>
+              <w:rPr>
+                <w:color w:val="000000" w:themeColor="text1"/>
+                <w:sz w:val="24"/>
+                <w:szCs w:val="24"/>
+                <w:lang w:val="en-US"/>
+              </w:rPr>
+            </w:pPr>
+            <w:r>
+              <w:rPr>
+                <w:color w:val="000000" w:themeColor="text1"/>
+                <w:sz w:val="24"/>
+                <w:szCs w:val="24"/>
+                <w:lang w:val="en-US"/>
+              </w:rPr>
+              <w:t>Frequency</w:t>
+            </w:r>
+          </w:p>
+        </w:tc>
+        <w:tc>
+          <w:tcPr>
+            <w:tcW w:w="4283" w:type="dxa"/>
+            <w:vAlign w:val="center"/>
+            <w:hideMark/>
+          </w:tcPr>
+          <w:p>
+            <w:pPr>
+              <w:rPr>
+                <w:color w:val="000000" w:themeColor="text1"/>
+                <w:sz w:val="24"/>
+                <w:szCs w:val="24"/>
+                <w:lang w:val="en-US"/>
+              </w:rPr>
+            </w:pPr>
+            <w:r>
+              <w:rPr>
+                <w:color w:val="000000" w:themeColor="text1"/>
+                <w:sz w:val="24"/>
+                <w:szCs w:val="24"/>
+                <w:lang w:val="en-US"/>
+              </w:rPr>
+              <w:t>Tổng số đơn hàng</w:t>
+            </w:r>
+          </w:p>
+        </w:tc>
+      </w:tr>
+      <w:tr>
+        <w:trPr>
+          <w:tblCellSpacing w:w="15" w:type="dxa"/>
+        </w:trPr>
+        <w:tc>
+          <w:tcPr>
+            <w:tcW w:w="0" w:type="auto"/>
+            <w:vAlign w:val="center"/>
+            <w:hideMark/>
+          </w:tcPr>
+          <w:p>
+            <w:pPr>
+              <w:rPr>
+                <w:color w:val="000000" w:themeColor="text1"/>
+                <w:sz w:val="24"/>
+                <w:szCs w:val="24"/>
+                <w:lang w:val="en-US"/>
+              </w:rPr>
+            </w:pPr>
+            <w:r>
+              <w:rPr>
+                <w:color w:val="000000" w:themeColor="text1"/>
+                <w:sz w:val="24"/>
+                <w:szCs w:val="24"/>
+                <w:lang w:val="en-US"/>
+              </w:rPr>
+              <w:t>Monetary</w:t>
+            </w:r>
+          </w:p>
+        </w:tc>
+        <w:tc>
+          <w:tcPr>
+            <w:tcW w:w="4283" w:type="dxa"/>
+            <w:vAlign w:val="center"/>
+            <w:hideMark/>
+          </w:tcPr>
+          <w:p>
+            <w:pPr>
+              <w:rPr>
+                <w:color w:val="000000" w:themeColor="text1"/>
+                <w:sz w:val="24"/>
+                <w:szCs w:val="24"/>
+                <w:lang w:val="en-US"/>
+              </w:rPr>
+            </w:pPr>
+            <w:r>
+              <w:rPr>
+                <w:color w:val="000000" w:themeColor="text1"/>
+                <w:sz w:val="24"/>
+                <w:szCs w:val="24"/>
+                <w:lang w:val="en-US"/>
+              </w:rPr>
+              <w:t>Tổng doanh thu đóng góp</w:t>
+            </w:r>
+          </w:p>
+        </w:tc>
+      </w:tr>
+      <w:tr>
+        <w:trPr>
+          <w:tblCellSpacing w:w="15" w:type="dxa"/>
+        </w:trPr>
+        <w:tc>
+          <w:tcPr>
+            <w:tcW w:w="0" w:type="auto"/>
+            <w:vAlign w:val="center"/>
+            <w:hideMark/>
+          </w:tcPr>
+          <w:p>
+            <w:pPr>
+              <w:rPr>
+                <w:color w:val="000000" w:themeColor="text1"/>
+                <w:sz w:val="24"/>
+                <w:szCs w:val="24"/>
+                <w:lang w:val="en-US"/>
+              </w:rPr>
+            </w:pPr>
+            <w:r>
+              <w:rPr>
+                <w:color w:val="000000" w:themeColor="text1"/>
+                <w:sz w:val="24"/>
+                <w:szCs w:val="24"/>
+                <w:lang w:val="en-US"/>
+              </w:rPr>
+              <w:t>Customer Segment</w:t>
+            </w:r>
+          </w:p>
+        </w:tc>
+        <w:tc>
+          <w:tcPr>
+            <w:tcW w:w="4283" w:type="dxa"/>
+            <w:vAlign w:val="center"/>
+            <w:hideMark/>
+          </w:tcPr>
+          <w:p>
+            <w:pPr>
+              <w:rPr>
+                <w:color w:val="000000" w:themeColor="text1"/>
+                <w:sz w:val="24"/>
+                <w:szCs w:val="24"/>
+                <w:lang w:val="en-US"/>
+              </w:rPr>
+            </w:pPr>
+            <w:r>
+              <w:rPr>
+                <w:color w:val="000000" w:themeColor="text1"/>
+                <w:sz w:val="24"/>
+                <w:szCs w:val="24"/>
+                <w:lang w:val="en-US"/>
+              </w:rPr>
+              <w:t>Champions, Loyal, At Risk, Lost</w:t>
+            </w:r>
+          </w:p>
+        </w:tc>
+      </w:tr>
+    </w:tbl>
+    <w:p>
+      <w:pPr>
+        <w:rPr>
+          <w:color w:val="000000" w:themeColor="text1"/>
+          <w:sz w:val="24"/>
+          <w:szCs w:val="24"/>
+          <w:lang w:val="vi-VN"/>
+        </w:rPr>
+      </w:pPr>
+    </w:p>
+    <w:p>
+      <w:pPr>
+        <w:pStyle w:val="ListParagraph"/>
+        <w:numPr>
+          <w:ilvl w:val="0"/>
+          <w:numId w:val="36"/>
+        </w:numPr>
+        <w:rPr>
+          <w:b/>
+          <w:bCs/>
+          <w:color w:val="000000" w:themeColor="text1"/>
+          <w:sz w:val="24"/>
+          <w:szCs w:val="24"/>
+          <w:lang w:val="vi-VN"/>
+        </w:rPr>
+      </w:pPr>
+      <w:r>
+        <w:rPr>
+          <w:b/>
+          <w:bCs/>
+          <w:color w:val="000000" w:themeColor="text1"/>
+          <w:sz w:val="24"/>
+          <w:szCs w:val="24"/>
+        </w:rPr>
+        <w:t>Nhóm KPI vận hành (Operational KPIs)</w:t>
+      </w:r>
+    </w:p>
+    <w:tbl>
+      <w:tblPr>
+        <w:tblW w:w="0" w:type="auto"/>
+        <w:tblCellSpacing w:w="15" w:type="dxa"/>
+        <w:tblCellMar>
+          <w:top w:w="15" w:type="dxa"/>
+          <w:left w:w="15" w:type="dxa"/>
+          <w:bottom w:w="15" w:type="dxa"/>
+          <w:right w:w="15" w:type="dxa"/>
+        </w:tblCellMar>
+        <w:tblLook w:val="04A0" w:firstRow="1" w:lastRow="0" w:firstColumn="1" w:lastColumn="0" w:noHBand="0" w:noVBand="1"/>
+      </w:tblPr>
+      <w:tblGrid>
+        <w:gridCol w:w="2022"/>
+        <w:gridCol w:w="4215"/>
+      </w:tblGrid>
+      <w:tr>
+        <w:trPr>
+          <w:tblHeader/>
+          <w:tblCellSpacing w:w="15" w:type="dxa"/>
+        </w:trPr>
+        <w:tc>
+          <w:tcPr>
+            <w:tcW w:w="0" w:type="auto"/>
+            <w:vAlign w:val="center"/>
+            <w:hideMark/>
+          </w:tcPr>
+          <w:p>
+            <w:pPr>
+              <w:rPr>
+                <w:b/>
+                <w:bCs/>
+                <w:color w:val="000000" w:themeColor="text1"/>
+                <w:sz w:val="24"/>
+                <w:szCs w:val="24"/>
+                <w:lang w:val="en-US"/>
+              </w:rPr>
+            </w:pPr>
+            <w:r>
+              <w:rPr>
+                <w:b/>
+                <w:bCs/>
+                <w:color w:val="000000" w:themeColor="text1"/>
+                <w:sz w:val="24"/>
+                <w:szCs w:val="24"/>
+                <w:lang w:val="en-US"/>
+              </w:rPr>
+              <w:t>KPI</w:t>
+            </w:r>
+          </w:p>
+        </w:tc>
+        <w:tc>
+          <w:tcPr>
+            <w:tcW w:w="4170" w:type="dxa"/>
+            <w:vAlign w:val="center"/>
+            <w:hideMark/>
+          </w:tcPr>
+          <w:p>
+            <w:pPr>
+              <w:rPr>
+                <w:b/>
+                <w:bCs/>
+                <w:color w:val="000000" w:themeColor="text1"/>
+                <w:sz w:val="24"/>
+                <w:szCs w:val="24"/>
+                <w:lang w:val="en-US"/>
+              </w:rPr>
+            </w:pPr>
+            <w:r>
+              <w:rPr>
+                <w:b/>
+                <w:bCs/>
+                <w:color w:val="000000" w:themeColor="text1"/>
+                <w:sz w:val="24"/>
+                <w:szCs w:val="24"/>
+                <w:lang w:val="en-US"/>
+              </w:rPr>
+              <w:t>Mô tả</w:t>
+            </w:r>
+          </w:p>
+        </w:tc>
+      </w:tr>
+      <w:tr>
+        <w:trPr>
+          <w:tblCellSpacing w:w="15" w:type="dxa"/>
+        </w:trPr>
+        <w:tc>
+          <w:tcPr>
+            <w:tcW w:w="0" w:type="auto"/>
+            <w:vAlign w:val="center"/>
+            <w:hideMark/>
+          </w:tcPr>
+          <w:p>
+            <w:pPr>
+              <w:rPr>
+                <w:color w:val="000000" w:themeColor="text1"/>
+                <w:sz w:val="24"/>
+                <w:szCs w:val="24"/>
+                <w:lang w:val="en-US"/>
+              </w:rPr>
+            </w:pPr>
+            <w:r>
+              <w:rPr>
+                <w:color w:val="000000" w:themeColor="text1"/>
+                <w:sz w:val="24"/>
+                <w:szCs w:val="24"/>
+                <w:lang w:val="en-US"/>
+              </w:rPr>
+              <w:t>Delivery Days</w:t>
+            </w:r>
+          </w:p>
+        </w:tc>
+        <w:tc>
+          <w:tcPr>
+            <w:tcW w:w="4170" w:type="dxa"/>
+            <w:vAlign w:val="center"/>
+            <w:hideMark/>
+          </w:tcPr>
+          <w:p>
+            <w:pPr>
+              <w:rPr>
+                <w:color w:val="000000" w:themeColor="text1"/>
+                <w:sz w:val="24"/>
+                <w:szCs w:val="24"/>
+                <w:lang w:val="en-US"/>
+              </w:rPr>
+            </w:pPr>
+            <w:r>
+              <w:rPr>
+                <w:color w:val="000000" w:themeColor="text1"/>
+                <w:sz w:val="24"/>
+                <w:szCs w:val="24"/>
+                <w:lang w:val="en-US"/>
+              </w:rPr>
+              <w:t>Thời gian giao hàng</w:t>
+            </w:r>
+          </w:p>
+        </w:tc>
+      </w:tr>
+      <w:tr>
+        <w:trPr>
+          <w:tblCellSpacing w:w="15" w:type="dxa"/>
+        </w:trPr>
+        <w:tc>
+          <w:tcPr>
+            <w:tcW w:w="0" w:type="auto"/>
+            <w:vAlign w:val="center"/>
+            <w:hideMark/>
+          </w:tcPr>
+          <w:p>
+            <w:pPr>
+              <w:rPr>
+                <w:color w:val="000000" w:themeColor="text1"/>
+                <w:sz w:val="24"/>
+                <w:szCs w:val="24"/>
+                <w:lang w:val="en-US"/>
+              </w:rPr>
+            </w:pPr>
+            <w:r>
+              <w:rPr>
+                <w:color w:val="000000" w:themeColor="text1"/>
+                <w:sz w:val="24"/>
+                <w:szCs w:val="24"/>
+                <w:lang w:val="en-US"/>
+              </w:rPr>
+              <w:t>Late Delivery Rate</w:t>
+            </w:r>
+          </w:p>
+        </w:tc>
+        <w:tc>
+          <w:tcPr>
+            <w:tcW w:w="4170" w:type="dxa"/>
+            <w:vAlign w:val="center"/>
+            <w:hideMark/>
+          </w:tcPr>
+          <w:p>
+            <w:pPr>
+              <w:rPr>
+                <w:color w:val="000000" w:themeColor="text1"/>
+                <w:sz w:val="24"/>
+                <w:szCs w:val="24"/>
+                <w:lang w:val="en-US"/>
+              </w:rPr>
+            </w:pPr>
+            <w:r>
+              <w:rPr>
+                <w:color w:val="000000" w:themeColor="text1"/>
+                <w:sz w:val="24"/>
+                <w:szCs w:val="24"/>
+                <w:lang w:val="en-US"/>
+              </w:rPr>
+              <w:t>% đơn giao trễ</w:t>
+            </w:r>
+          </w:p>
+        </w:tc>
+      </w:tr>
+      <w:tr>
+        <w:trPr>
+          <w:tblCellSpacing w:w="15" w:type="dxa"/>
+        </w:trPr>
+        <w:tc>
+          <w:tcPr>
+            <w:tcW w:w="0" w:type="auto"/>
+            <w:vAlign w:val="center"/>
+            <w:hideMark/>
+          </w:tcPr>
+          <w:p>
+            <w:pPr>
+              <w:rPr>
+                <w:color w:val="000000" w:themeColor="text1"/>
+                <w:sz w:val="24"/>
+                <w:szCs w:val="24"/>
+                <w:lang w:val="en-US"/>
+              </w:rPr>
+            </w:pPr>
+            <w:r>
+              <w:rPr>
+                <w:color w:val="000000" w:themeColor="text1"/>
+                <w:sz w:val="24"/>
+                <w:szCs w:val="24"/>
+                <w:lang w:val="en-US"/>
+              </w:rPr>
+              <w:t>Shipping Cost Ratio</w:t>
+            </w:r>
+          </w:p>
+        </w:tc>
+        <w:tc>
+          <w:tcPr>
+            <w:tcW w:w="4170" w:type="dxa"/>
+            <w:vAlign w:val="center"/>
+            <w:hideMark/>
+          </w:tcPr>
+          <w:p>
+            <w:pPr>
+              <w:rPr>
+                <w:color w:val="000000" w:themeColor="text1"/>
+                <w:sz w:val="24"/>
+                <w:szCs w:val="24"/>
+                <w:lang w:val="en-US"/>
+              </w:rPr>
+            </w:pPr>
+            <w:r>
+              <w:rPr>
+                <w:color w:val="000000" w:themeColor="text1"/>
+                <w:sz w:val="24"/>
+                <w:szCs w:val="24"/>
+                <w:lang w:val="en-US"/>
+              </w:rPr>
+              <w:t>Shipping Cost / Sales</w:t>
+            </w:r>
+          </w:p>
+        </w:tc>
+      </w:tr>
+    </w:tbl>
+    <w:p>
+      <w:pPr>
+        <w:rPr>
+          <w:b/>
+          <w:bCs/>
+          <w:color w:val="000000" w:themeColor="text1"/>
+          <w:sz w:val="24"/>
+          <w:szCs w:val="24"/>
+          <w:lang w:val="vi-VN"/>
+        </w:rPr>
+      </w:pPr>
+    </w:p>
     <w:sectPr>
       <w:headerReference w:type="default" r:id="rId11"/>
       <w:footerReference w:type="default" r:id="rId12"/>
@@ -28498,6 +29764,95 @@
     </w:lvl>
   </w:abstractNum>
   <w:abstractNum w:abstractNumId="19" w15:restartNumberingAfterBreak="0">
+    <w:nsid w:val="3F555EA9"/>
+    <w:multiLevelType w:val="hybridMultilevel"/>
+    <w:tmpl w:val="AE103EA4"/>
+    <w:lvl w:ilvl="0" w:tplc="0409000F">
+      <w:start w:val="1"/>
+      <w:numFmt w:val="decimal"/>
+      <w:lvlText w:val="%1."/>
+      <w:lvlJc w:val="left"/>
+      <w:pPr>
+        <w:ind w:left="720" w:hanging="360"/>
+      </w:pPr>
+      <w:rPr>
+        <w:rFonts w:hint="default"/>
+      </w:rPr>
+    </w:lvl>
+    <w:lvl w:ilvl="1" w:tplc="04090019" w:tentative="1">
+      <w:start w:val="1"/>
+      <w:numFmt w:val="lowerLetter"/>
+      <w:lvlText w:val="%2."/>
+      <w:lvlJc w:val="left"/>
+      <w:pPr>
+        <w:ind w:left="1440" w:hanging="360"/>
+      </w:pPr>
+    </w:lvl>
+    <w:lvl w:ilvl="2" w:tplc="0409001B" w:tentative="1">
+      <w:start w:val="1"/>
+      <w:numFmt w:val="lowerRoman"/>
+      <w:lvlText w:val="%3."/>
+      <w:lvlJc w:val="right"/>
+      <w:pPr>
+        <w:ind w:left="2160" w:hanging="180"/>
+      </w:pPr>
+    </w:lvl>
+    <w:lvl w:ilvl="3" w:tplc="0409000F" w:tentative="1">
+      <w:start w:val="1"/>
+      <w:numFmt w:val="decimal"/>
+      <w:lvlText w:val="%4."/>
+      <w:lvlJc w:val="left"/>
+      <w:pPr>
+        <w:ind w:left="2880" w:hanging="360"/>
+      </w:pPr>
+    </w:lvl>
+    <w:lvl w:ilvl="4" w:tplc="04090019" w:tentative="1">
+      <w:start w:val="1"/>
+      <w:numFmt w:val="lowerLetter"/>
+      <w:lvlText w:val="%5."/>
+      <w:lvlJc w:val="left"/>
+      <w:pPr>
+        <w:ind w:left="3600" w:hanging="360"/>
+      </w:pPr>
+    </w:lvl>
+    <w:lvl w:ilvl="5" w:tplc="0409001B" w:tentative="1">
+      <w:start w:val="1"/>
+      <w:numFmt w:val="lowerRoman"/>
+      <w:lvlText w:val="%6."/>
+      <w:lvlJc w:val="right"/>
+      <w:pPr>
+        <w:ind w:left="4320" w:hanging="180"/>
+      </w:pPr>
+    </w:lvl>
+    <w:lvl w:ilvl="6" w:tplc="0409000F" w:tentative="1">
+      <w:start w:val="1"/>
+      <w:numFmt w:val="decimal"/>
+      <w:lvlText w:val="%7."/>
+      <w:lvlJc w:val="left"/>
+      <w:pPr>
+        <w:ind w:left="5040" w:hanging="360"/>
+      </w:pPr>
+    </w:lvl>
+    <w:lvl w:ilvl="7" w:tplc="04090019" w:tentative="1">
+      <w:start w:val="1"/>
+      <w:numFmt w:val="lowerLetter"/>
+      <w:lvlText w:val="%8."/>
+      <w:lvlJc w:val="left"/>
+      <w:pPr>
+        <w:ind w:left="5760" w:hanging="360"/>
+      </w:pPr>
+    </w:lvl>
+    <w:lvl w:ilvl="8" w:tplc="0409001B" w:tentative="1">
+      <w:start w:val="1"/>
+      <w:numFmt w:val="lowerRoman"/>
+      <w:lvlText w:val="%9."/>
+      <w:lvlJc w:val="right"/>
+      <w:pPr>
+        <w:ind w:left="6480" w:hanging="180"/>
+      </w:pPr>
+    </w:lvl>
+  </w:abstractNum>
+  <w:abstractNum w:abstractNumId="20" w15:restartNumberingAfterBreak="0">
     <w:nsid w:val="45464C28"/>
     <w:multiLevelType w:val="hybridMultilevel"/>
     <w:tmpl w:val="A8DA4E26"/>
@@ -28610,7 +29965,7 @@
       </w:rPr>
     </w:lvl>
   </w:abstractNum>
-  <w:abstractNum w:abstractNumId="20" w15:restartNumberingAfterBreak="0">
+  <w:abstractNum w:abstractNumId="21" w15:restartNumberingAfterBreak="0">
     <w:nsid w:val="494A5FAE"/>
     <w:multiLevelType w:val="multilevel"/>
     <w:tmpl w:val="DFE04BCE"/>
@@ -28759,7 +30114,7 @@
       </w:rPr>
     </w:lvl>
   </w:abstractNum>
-  <w:abstractNum w:abstractNumId="21" w15:restartNumberingAfterBreak="0">
+  <w:abstractNum w:abstractNumId="22" w15:restartNumberingAfterBreak="0">
     <w:nsid w:val="4BDA3EB0"/>
     <w:multiLevelType w:val="hybridMultilevel"/>
     <w:tmpl w:val="2B98EC22"/>
@@ -28872,7 +30227,7 @@
       </w:rPr>
     </w:lvl>
   </w:abstractNum>
-  <w:abstractNum w:abstractNumId="22" w15:restartNumberingAfterBreak="0">
+  <w:abstractNum w:abstractNumId="23" w15:restartNumberingAfterBreak="0">
     <w:nsid w:val="50631EB1"/>
     <w:multiLevelType w:val="multilevel"/>
     <w:tmpl w:val="3952496E"/>
@@ -29021,7 +30376,7 @@
       </w:rPr>
     </w:lvl>
   </w:abstractNum>
-  <w:abstractNum w:abstractNumId="23" w15:restartNumberingAfterBreak="0">
+  <w:abstractNum w:abstractNumId="24" w15:restartNumberingAfterBreak="0">
     <w:nsid w:val="572D2F75"/>
     <w:multiLevelType w:val="multilevel"/>
     <w:tmpl w:val="C41E6BFA"/>
@@ -29134,7 +30489,7 @@
       </w:rPr>
     </w:lvl>
   </w:abstractNum>
-  <w:abstractNum w:abstractNumId="24" w15:restartNumberingAfterBreak="0">
+  <w:abstractNum w:abstractNumId="25" w15:restartNumberingAfterBreak="0">
     <w:nsid w:val="5A470D04"/>
     <w:multiLevelType w:val="multilevel"/>
     <w:tmpl w:val="FDFC4820"/>
@@ -29247,7 +30602,7 @@
       </w:rPr>
     </w:lvl>
   </w:abstractNum>
-  <w:abstractNum w:abstractNumId="25" w15:restartNumberingAfterBreak="0">
+  <w:abstractNum w:abstractNumId="26" w15:restartNumberingAfterBreak="0">
     <w:nsid w:val="5B2C79EF"/>
     <w:multiLevelType w:val="multilevel"/>
     <w:tmpl w:val="1A161174"/>
@@ -29396,7 +30751,7 @@
       </w:rPr>
     </w:lvl>
   </w:abstractNum>
-  <w:abstractNum w:abstractNumId="26" w15:restartNumberingAfterBreak="0">
+  <w:abstractNum w:abstractNumId="27" w15:restartNumberingAfterBreak="0">
     <w:nsid w:val="60613781"/>
     <w:multiLevelType w:val="multilevel"/>
     <w:tmpl w:val="12E6481A"/>
@@ -29513,7 +30868,7 @@
       </w:pPr>
     </w:lvl>
   </w:abstractNum>
-  <w:abstractNum w:abstractNumId="27" w15:restartNumberingAfterBreak="0">
+  <w:abstractNum w:abstractNumId="28" w15:restartNumberingAfterBreak="0">
     <w:nsid w:val="64027927"/>
     <w:multiLevelType w:val="multilevel"/>
     <w:tmpl w:val="57B085F4"/>
@@ -29662,7 +31017,7 @@
       </w:rPr>
     </w:lvl>
   </w:abstractNum>
-  <w:abstractNum w:abstractNumId="28" w15:restartNumberingAfterBreak="0">
+  <w:abstractNum w:abstractNumId="29" w15:restartNumberingAfterBreak="0">
     <w:nsid w:val="65540C24"/>
     <w:multiLevelType w:val="multilevel"/>
     <w:tmpl w:val="E55EE344"/>
@@ -29811,7 +31166,7 @@
       </w:rPr>
     </w:lvl>
   </w:abstractNum>
-  <w:abstractNum w:abstractNumId="29" w15:restartNumberingAfterBreak="0">
+  <w:abstractNum w:abstractNumId="30" w15:restartNumberingAfterBreak="0">
     <w:nsid w:val="66B753F0"/>
     <w:multiLevelType w:val="multilevel"/>
     <w:tmpl w:val="D46A757A"/>
@@ -29960,7 +31315,7 @@
       </w:rPr>
     </w:lvl>
   </w:abstractNum>
-  <w:abstractNum w:abstractNumId="30" w15:restartNumberingAfterBreak="0">
+  <w:abstractNum w:abstractNumId="31" w15:restartNumberingAfterBreak="0">
     <w:nsid w:val="687514B8"/>
     <w:multiLevelType w:val="multilevel"/>
     <w:tmpl w:val="100E2ECA"/>
@@ -30109,7 +31464,7 @@
       </w:rPr>
     </w:lvl>
   </w:abstractNum>
-  <w:abstractNum w:abstractNumId="31" w15:restartNumberingAfterBreak="0">
+  <w:abstractNum w:abstractNumId="32" w15:restartNumberingAfterBreak="0">
     <w:nsid w:val="7019437D"/>
     <w:multiLevelType w:val="multilevel"/>
     <w:tmpl w:val="C5D4C900"/>
@@ -30225,7 +31580,7 @@
       </w:rPr>
     </w:lvl>
   </w:abstractNum>
-  <w:abstractNum w:abstractNumId="32" w15:restartNumberingAfterBreak="0">
+  <w:abstractNum w:abstractNumId="33" w15:restartNumberingAfterBreak="0">
     <w:nsid w:val="7AAC71E0"/>
     <w:multiLevelType w:val="multilevel"/>
     <w:tmpl w:val="F544C93C"/>
@@ -30374,7 +31729,7 @@
       </w:rPr>
     </w:lvl>
   </w:abstractNum>
-  <w:abstractNum w:abstractNumId="33" w15:restartNumberingAfterBreak="0">
+  <w:abstractNum w:abstractNumId="34" w15:restartNumberingAfterBreak="0">
     <w:nsid w:val="7DC66BBE"/>
     <w:multiLevelType w:val="hybridMultilevel"/>
     <w:tmpl w:val="27A09F56"/>
@@ -30487,7 +31842,7 @@
       </w:rPr>
     </w:lvl>
   </w:abstractNum>
-  <w:abstractNum w:abstractNumId="34" w15:restartNumberingAfterBreak="0">
+  <w:abstractNum w:abstractNumId="35" w15:restartNumberingAfterBreak="0">
     <w:nsid w:val="7EB40885"/>
     <w:multiLevelType w:val="hybridMultilevel"/>
     <w:tmpl w:val="F6D86172"/>
@@ -30601,16 +31956,16 @@
     </w:lvl>
   </w:abstractNum>
   <w:num w:numId="1" w16cid:durableId="11423171">
-    <w:abstractNumId w:val="31"/>
+    <w:abstractNumId w:val="32"/>
   </w:num>
   <w:num w:numId="2" w16cid:durableId="2072117257">
     <w:abstractNumId w:val="5"/>
   </w:num>
   <w:num w:numId="3" w16cid:durableId="749084407">
-    <w:abstractNumId w:val="24"/>
+    <w:abstractNumId w:val="25"/>
   </w:num>
   <w:num w:numId="4" w16cid:durableId="1660648760">
-    <w:abstractNumId w:val="23"/>
+    <w:abstractNumId w:val="24"/>
   </w:num>
   <w:num w:numId="5" w16cid:durableId="1314482577">
     <w:abstractNumId w:val="4"/>
@@ -30625,31 +31980,31 @@
     <w:abstractNumId w:val="6"/>
   </w:num>
   <w:num w:numId="9" w16cid:durableId="903415421">
-    <w:abstractNumId w:val="29"/>
+    <w:abstractNumId w:val="30"/>
   </w:num>
   <w:num w:numId="10" w16cid:durableId="821191211">
     <w:abstractNumId w:val="7"/>
   </w:num>
   <w:num w:numId="11" w16cid:durableId="1015349646">
-    <w:abstractNumId w:val="20"/>
+    <w:abstractNumId w:val="21"/>
   </w:num>
   <w:num w:numId="12" w16cid:durableId="2095515606">
-    <w:abstractNumId w:val="21"/>
+    <w:abstractNumId w:val="22"/>
   </w:num>
   <w:num w:numId="13" w16cid:durableId="1073043454">
-    <w:abstractNumId w:val="30"/>
+    <w:abstractNumId w:val="31"/>
   </w:num>
   <w:num w:numId="14" w16cid:durableId="696002016">
-    <w:abstractNumId w:val="27"/>
+    <w:abstractNumId w:val="28"/>
   </w:num>
   <w:num w:numId="15" w16cid:durableId="1077823692">
     <w:abstractNumId w:val="13"/>
   </w:num>
   <w:num w:numId="16" w16cid:durableId="1527215684">
-    <w:abstractNumId w:val="32"/>
+    <w:abstractNumId w:val="33"/>
   </w:num>
   <w:num w:numId="17" w16cid:durableId="707997089">
-    <w:abstractNumId w:val="28"/>
+    <w:abstractNumId w:val="29"/>
   </w:num>
   <w:num w:numId="18" w16cid:durableId="902057253">
     <w:abstractNumId w:val="10"/>
@@ -30670,13 +32025,13 @@
     <w:abstractNumId w:val="3"/>
   </w:num>
   <w:num w:numId="24" w16cid:durableId="765228938">
-    <w:abstractNumId w:val="22"/>
+    <w:abstractNumId w:val="23"/>
   </w:num>
   <w:num w:numId="25" w16cid:durableId="1277903781">
     <w:abstractNumId w:val="18"/>
   </w:num>
   <w:num w:numId="26" w16cid:durableId="1975283011">
-    <w:abstractNumId w:val="25"/>
+    <w:abstractNumId w:val="26"/>
   </w:num>
   <w:num w:numId="27" w16cid:durableId="1984967396">
     <w:abstractNumId w:val="0"/>
@@ -30691,19 +32046,22 @@
     <w:abstractNumId w:val="2"/>
   </w:num>
   <w:num w:numId="31" w16cid:durableId="223834726">
-    <w:abstractNumId w:val="33"/>
+    <w:abstractNumId w:val="34"/>
   </w:num>
   <w:num w:numId="32" w16cid:durableId="1974015306">
-    <w:abstractNumId w:val="34"/>
+    <w:abstractNumId w:val="35"/>
   </w:num>
   <w:num w:numId="33" w16cid:durableId="1379015520">
-    <w:abstractNumId w:val="26"/>
+    <w:abstractNumId w:val="27"/>
   </w:num>
   <w:num w:numId="34" w16cid:durableId="1286615434">
-    <w:abstractNumId w:val="19"/>
+    <w:abstractNumId w:val="20"/>
   </w:num>
   <w:num w:numId="35" w16cid:durableId="1868909025">
     <w:abstractNumId w:val="1"/>
+  </w:num>
+  <w:num w:numId="36" w16cid:durableId="1441955370">
+    <w:abstractNumId w:val="19"/>
   </w:num>
   <w:numIdMacAtCleanup w:val="30"/>
 </w:numbering>
@@ -31329,7 +32687,6 @@
   <w:style w:type="character" w:default="1" w:styleId="DefaultParagraphFont">
     <w:name w:val="Default Paragraph Font"/>
     <w:uiPriority w:val="1"/>
-    <w:semiHidden/>
     <w:unhideWhenUsed/>
   </w:style>
   <w:style w:type="table" w:default="1" w:styleId="TableNormal">
@@ -32457,28 +33814,28 @@
 </file>
 
 <file path=customXml/item1.xml><?xml version="1.0" encoding="utf-8"?>
+<b:Sources xmlns:b="http://schemas.openxmlformats.org/officeDocument/2006/bibliography" xmlns="http://schemas.openxmlformats.org/officeDocument/2006/bibliography" SelectedStyle="\APASixthEditionOfficeOnline.xsl" StyleName="APA" Version="6"/>
+</file>
+
+<file path=customXml/item2.xml><?xml version="1.0" encoding="utf-8"?>
 <go:gDocsCustomXmlDataStorage xmlns:go="http://customooxmlschemas.google.com/" xmlns:r="http://schemas.openxmlformats.org/officeDocument/2006/relationships" uri="GoogleDocsCustomDataVersion2">
   <go:docsCustomData xmlns:go="http://customooxmlschemas.google.com/" roundtripDataSignature="AMtx7mgiPnSzeFcphxz7x95siPLEGky12A==">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</go:docsCustomData>
 </go:gDocsCustomXmlDataStorage>
 </file>
 
-<file path=customXml/item2.xml><?xml version="1.0" encoding="utf-8"?>
-<b:Sources xmlns:b="http://schemas.openxmlformats.org/officeDocument/2006/bibliography" xmlns="http://schemas.openxmlformats.org/officeDocument/2006/bibliography" SelectedStyle="\APASixthEditionOfficeOnline.xsl" StyleName="APA" Version="6"/>
+<file path=customXml/itemProps1.xml><?xml version="1.0" encoding="utf-8"?>
+<ds:datastoreItem xmlns:ds="http://schemas.openxmlformats.org/officeDocument/2006/customXml" ds:itemID="{6BA7E6F1-37ED-4F0B-9095-9991D41BCB91}">
+  <ds:schemaRefs>
+    <ds:schemaRef ds:uri="http://schemas.openxmlformats.org/officeDocument/2006/bibliography"/>
+  </ds:schemaRefs>
+</ds:datastoreItem>
 </file>
 
-<file path=customXml/itemProps1.xml><?xml version="1.0" encoding="utf-8"?>
+<file path=customXml/itemProps2.xml><?xml version="1.0" encoding="utf-8"?>
 <ds:datastoreItem xmlns:ds="http://schemas.openxmlformats.org/officeDocument/2006/customXml" ds:itemID="{11111111-1234-1234-1234-123412341234}">
   <ds:schemaRefs>
     <ds:schemaRef ds:uri="http://customooxmlschemas.google.com/"/>
     <ds:schemaRef ds:uri="http://schemas.openxmlformats.org/officeDocument/2006/relationships"/>
   </ds:schemaRefs>
 </ds:datastoreItem>
-</file>
-
-<file path=customXml/itemProps2.xml><?xml version="1.0" encoding="utf-8"?>
-<ds:datastoreItem xmlns:ds="http://schemas.openxmlformats.org/officeDocument/2006/customXml" ds:itemID="{6BA7E6F1-37ED-4F0B-9095-9991D41BCB91}">
-  <ds:schemaRefs>
-    <ds:schemaRef ds:uri="http://schemas.openxmlformats.org/officeDocument/2006/bibliography"/>
-  </ds:schemaRefs>
-</ds:datastoreItem>
 </file>
</xml_diff>

<commit_message>
căn chỉnh, sửa lỗi chính tả
</commit_message>
<xml_diff>
--- a/Báo cáo chính.docx
+++ b/Báo cáo chính.docx
@@ -1080,7 +1080,7 @@
                                     <pic:cNvPicPr/>
                                   </pic:nvPicPr>
                                   <pic:blipFill>
-                                    <a:blip r:embed="rId9">
+                                    <a:blip r:embed="rId10">
                                       <a:extLst>
                                         <a:ext uri="{28A0092B-C50C-407E-A947-70E740481C1C}">
                                           <a14:useLocalDpi xmlns:a14="http://schemas.microsoft.com/office/drawing/2010/main" val="0"/>
@@ -7895,7 +7895,7 @@
                     <pic:cNvPicPr/>
                   </pic:nvPicPr>
                   <pic:blipFill>
-                    <a:blip r:embed="rId10"/>
+                    <a:blip r:embed="rId11"/>
                     <a:stretch>
                       <a:fillRect/>
                     </a:stretch>
@@ -27721,35 +27721,7 @@
           <w:sz w:val="28"/>
           <w:szCs w:val="28"/>
         </w:rPr>
-        <w:t xml:space="preserve">3.1 </w:t>
-      </w:r>
-      <w:r>
-        <w:rPr>
-          <w:sz w:val="28"/>
-          <w:szCs w:val="28"/>
-        </w:rPr>
-        <w:t>c</w:t>
-      </w:r>
-      <w:r>
-        <w:rPr>
-          <w:sz w:val="28"/>
-          <w:szCs w:val="28"/>
-        </w:rPr>
-        <w:t>ài đặt cấu hình (</w:t>
-      </w:r>
-      <w:r>
-        <w:rPr>
-          <w:sz w:val="28"/>
-          <w:szCs w:val="28"/>
-        </w:rPr>
-        <w:t>m</w:t>
-      </w:r>
-      <w:r>
-        <w:rPr>
-          <w:sz w:val="28"/>
-          <w:szCs w:val="28"/>
-        </w:rPr>
-        <w:t>odule: config.py)</w:t>
+        <w:t xml:space="preserve">3.1 cài đặt cấu hình </w:t>
       </w:r>
     </w:p>
     <w:p>
@@ -27765,23 +27737,7 @@
           <w:sz w:val="26"/>
           <w:szCs w:val="26"/>
         </w:rPr>
-        <w:t xml:space="preserve">3.1.1 </w:t>
-      </w:r>
-      <w:r>
-        <w:rPr>
-          <w:color w:val="EE0000"/>
-          <w:sz w:val="26"/>
-          <w:szCs w:val="26"/>
-        </w:rPr>
-        <w:t>m</w:t>
-      </w:r>
-      <w:r>
-        <w:rPr>
-          <w:color w:val="EE0000"/>
-          <w:sz w:val="26"/>
-          <w:szCs w:val="26"/>
-        </w:rPr>
-        <w:t>ục tiêu và vai trò</w:t>
+        <w:t>3.1.1 mục tiêu và vai trò</w:t>
       </w:r>
     </w:p>
     <w:p>
@@ -27825,12 +27781,6 @@
         <w:gridCol w:w="9026"/>
       </w:tblGrid>
       <w:tr>
-        <w:tblPrEx>
-          <w:tblCellMar>
-            <w:top w:w="0" w:type="dxa"/>
-            <w:bottom w:w="0" w:type="dxa"/>
-          </w:tblCellMar>
-        </w:tblPrEx>
         <w:tc>
           <w:tcPr>
             <w:tcW w:w="9026" w:type="dxa"/>
@@ -28246,7 +28196,7 @@
           <w:szCs w:val="24"/>
           <w:u w:val="single"/>
         </w:rPr>
-        <w:t>c) Ngưỡng nghiệp vụ (Domain Knowledge Thresholds)</w:t>
+        <w:t xml:space="preserve">c) Ngưỡng nghiệp vụ </w:t>
       </w:r>
     </w:p>
     <w:p>
@@ -28277,12 +28227,6 @@
         <w:gridCol w:w="3844"/>
       </w:tblGrid>
       <w:tr>
-        <w:tblPrEx>
-          <w:tblCellMar>
-            <w:top w:w="0" w:type="dxa"/>
-            <w:bottom w:w="0" w:type="dxa"/>
-          </w:tblCellMar>
-        </w:tblPrEx>
         <w:tc>
           <w:tcPr>
             <w:tcW w:w="3000" w:type="dxa"/>
@@ -28384,12 +28328,6 @@
         </w:tc>
       </w:tr>
       <w:tr>
-        <w:tblPrEx>
-          <w:tblCellMar>
-            <w:top w:w="0" w:type="dxa"/>
-            <w:bottom w:w="0" w:type="dxa"/>
-          </w:tblCellMar>
-        </w:tblPrEx>
         <w:tc>
           <w:tcPr>
             <w:tcW w:w="3000" w:type="dxa"/>
@@ -28480,12 +28418,6 @@
         </w:tc>
       </w:tr>
       <w:tr>
-        <w:tblPrEx>
-          <w:tblCellMar>
-            <w:top w:w="0" w:type="dxa"/>
-            <w:bottom w:w="0" w:type="dxa"/>
-          </w:tblCellMar>
-        </w:tblPrEx>
         <w:tc>
           <w:tcPr>
             <w:tcW w:w="2340" w:type="dxa"/>
@@ -28574,12 +28506,6 @@
         </w:tc>
       </w:tr>
       <w:tr>
-        <w:tblPrEx>
-          <w:tblCellMar>
-            <w:top w:w="0" w:type="dxa"/>
-            <w:bottom w:w="0" w:type="dxa"/>
-          </w:tblCellMar>
-        </w:tblPrEx>
         <w:tc>
           <w:tcPr>
             <w:tcW w:w="2340" w:type="dxa"/>
@@ -28668,12 +28594,6 @@
         </w:tc>
       </w:tr>
       <w:tr>
-        <w:tblPrEx>
-          <w:tblCellMar>
-            <w:top w:w="0" w:type="dxa"/>
-            <w:bottom w:w="0" w:type="dxa"/>
-          </w:tblCellMar>
-        </w:tblPrEx>
         <w:tc>
           <w:tcPr>
             <w:tcW w:w="2340" w:type="dxa"/>
@@ -28762,12 +28682,6 @@
         </w:tc>
       </w:tr>
       <w:tr>
-        <w:tblPrEx>
-          <w:tblCellMar>
-            <w:top w:w="0" w:type="dxa"/>
-            <w:bottom w:w="0" w:type="dxa"/>
-          </w:tblCellMar>
-        </w:tblPrEx>
         <w:tc>
           <w:tcPr>
             <w:tcW w:w="2340" w:type="dxa"/>
@@ -28882,12 +28796,6 @@
         <w:gridCol w:w="9026"/>
       </w:tblGrid>
       <w:tr>
-        <w:tblPrEx>
-          <w:tblCellMar>
-            <w:top w:w="0" w:type="dxa"/>
-            <w:bottom w:w="0" w:type="dxa"/>
-          </w:tblCellMar>
-        </w:tblPrEx>
         <w:tc>
           <w:tcPr>
             <w:tcW w:w="9026" w:type="dxa"/>
@@ -28971,21 +28879,7 @@
           <w:sz w:val="28"/>
           <w:szCs w:val="28"/>
         </w:rPr>
-        <w:t>hân tích dữ liệu khám phá (</w:t>
-      </w:r>
-      <w:r>
-        <w:rPr>
-          <w:sz w:val="28"/>
-          <w:szCs w:val="28"/>
-        </w:rPr>
-        <w:t>m</w:t>
-      </w:r>
-      <w:r>
-        <w:rPr>
-          <w:sz w:val="28"/>
-          <w:szCs w:val="28"/>
-        </w:rPr>
-        <w:t>odule: eda.py)</w:t>
+        <w:t xml:space="preserve">hân tích dữ liệu khám phá </w:t>
       </w:r>
     </w:p>
     <w:p>
@@ -29110,12 +29004,6 @@
         <w:gridCol w:w="3872"/>
       </w:tblGrid>
       <w:tr>
-        <w:tblPrEx>
-          <w:tblCellMar>
-            <w:top w:w="0" w:type="dxa"/>
-            <w:bottom w:w="0" w:type="dxa"/>
-          </w:tblCellMar>
-        </w:tblPrEx>
         <w:tc>
           <w:tcPr>
             <w:tcW w:w="3000" w:type="dxa"/>
@@ -29217,12 +29105,6 @@
         </w:tc>
       </w:tr>
       <w:tr>
-        <w:tblPrEx>
-          <w:tblCellMar>
-            <w:top w:w="0" w:type="dxa"/>
-            <w:bottom w:w="0" w:type="dxa"/>
-          </w:tblCellMar>
-        </w:tblPrEx>
         <w:tc>
           <w:tcPr>
             <w:tcW w:w="2340" w:type="dxa"/>
@@ -29311,12 +29193,6 @@
         </w:tc>
       </w:tr>
       <w:tr>
-        <w:tblPrEx>
-          <w:tblCellMar>
-            <w:top w:w="0" w:type="dxa"/>
-            <w:bottom w:w="0" w:type="dxa"/>
-          </w:tblCellMar>
-        </w:tblPrEx>
         <w:tc>
           <w:tcPr>
             <w:tcW w:w="2340" w:type="dxa"/>
@@ -29405,12 +29281,6 @@
         </w:tc>
       </w:tr>
       <w:tr>
-        <w:tblPrEx>
-          <w:tblCellMar>
-            <w:top w:w="0" w:type="dxa"/>
-            <w:bottom w:w="0" w:type="dxa"/>
-          </w:tblCellMar>
-        </w:tblPrEx>
         <w:tc>
           <w:tcPr>
             <w:tcW w:w="2340" w:type="dxa"/>
@@ -29611,12 +29481,6 @@
         <w:gridCol w:w="1448"/>
       </w:tblGrid>
       <w:tr>
-        <w:tblPrEx>
-          <w:tblCellMar>
-            <w:top w:w="0" w:type="dxa"/>
-            <w:bottom w:w="0" w:type="dxa"/>
-          </w:tblCellMar>
-        </w:tblPrEx>
         <w:tc>
           <w:tcPr>
             <w:tcW w:w="2000" w:type="dxa"/>
@@ -29817,12 +29681,6 @@
         </w:tc>
       </w:tr>
       <w:tr>
-        <w:tblPrEx>
-          <w:tblCellMar>
-            <w:top w:w="0" w:type="dxa"/>
-            <w:bottom w:w="0" w:type="dxa"/>
-          </w:tblCellMar>
-        </w:tblPrEx>
         <w:tc>
           <w:tcPr>
             <w:tcW w:w="2340" w:type="dxa"/>
@@ -29987,12 +29845,6 @@
         </w:tc>
       </w:tr>
       <w:tr>
-        <w:tblPrEx>
-          <w:tblCellMar>
-            <w:top w:w="0" w:type="dxa"/>
-            <w:bottom w:w="0" w:type="dxa"/>
-          </w:tblCellMar>
-        </w:tblPrEx>
         <w:tc>
           <w:tcPr>
             <w:tcW w:w="2340" w:type="dxa"/>
@@ -30159,12 +30011,6 @@
         </w:tc>
       </w:tr>
       <w:tr>
-        <w:tblPrEx>
-          <w:tblCellMar>
-            <w:top w:w="0" w:type="dxa"/>
-            <w:bottom w:w="0" w:type="dxa"/>
-          </w:tblCellMar>
-        </w:tblPrEx>
         <w:tc>
           <w:tcPr>
             <w:tcW w:w="2340" w:type="dxa"/>
@@ -30360,12 +30206,6 @@
         <w:gridCol w:w="9026"/>
       </w:tblGrid>
       <w:tr>
-        <w:tblPrEx>
-          <w:tblCellMar>
-            <w:top w:w="0" w:type="dxa"/>
-            <w:bottom w:w="0" w:type="dxa"/>
-          </w:tblCellMar>
-        </w:tblPrEx>
         <w:tc>
           <w:tcPr>
             <w:tcW w:w="9026" w:type="dxa"/>
@@ -30395,6 +30235,7 @@
                 <w:sz w:val="24"/>
                 <w:szCs w:val="24"/>
               </w:rPr>
+              <w:lastRenderedPageBreak/>
               <w:t>Phát hiện quan trọng từ EDA</w:t>
             </w:r>
           </w:p>
@@ -30431,7 +30272,7 @@
           <w:szCs w:val="24"/>
           <w:u w:val="single"/>
         </w:rPr>
-        <w:t>d) Phân bổ nghiệp vụ — analyze_business_overview()</w:t>
+        <w:t>d) Phân bổ nghiệp vụ</w:t>
       </w:r>
     </w:p>
     <w:p>
@@ -30461,12 +30302,6 @@
         <w:gridCol w:w="6747"/>
       </w:tblGrid>
       <w:tr>
-        <w:tblPrEx>
-          <w:tblCellMar>
-            <w:top w:w="0" w:type="dxa"/>
-            <w:bottom w:w="0" w:type="dxa"/>
-          </w:tblCellMar>
-        </w:tblPrEx>
         <w:tc>
           <w:tcPr>
             <w:tcW w:w="2000" w:type="dxa"/>
@@ -30535,12 +30370,6 @@
         </w:tc>
       </w:tr>
       <w:tr>
-        <w:tblPrEx>
-          <w:tblCellMar>
-            <w:top w:w="0" w:type="dxa"/>
-            <w:bottom w:w="0" w:type="dxa"/>
-          </w:tblCellMar>
-        </w:tblPrEx>
         <w:tc>
           <w:tcPr>
             <w:tcW w:w="2340" w:type="dxa"/>
@@ -30599,12 +30428,6 @@
         </w:tc>
       </w:tr>
       <w:tr>
-        <w:tblPrEx>
-          <w:tblCellMar>
-            <w:top w:w="0" w:type="dxa"/>
-            <w:bottom w:w="0" w:type="dxa"/>
-          </w:tblCellMar>
-        </w:tblPrEx>
         <w:tc>
           <w:tcPr>
             <w:tcW w:w="2340" w:type="dxa"/>
@@ -30663,12 +30486,6 @@
         </w:tc>
       </w:tr>
       <w:tr>
-        <w:tblPrEx>
-          <w:tblCellMar>
-            <w:top w:w="0" w:type="dxa"/>
-            <w:bottom w:w="0" w:type="dxa"/>
-          </w:tblCellMar>
-        </w:tblPrEx>
         <w:tc>
           <w:tcPr>
             <w:tcW w:w="2340" w:type="dxa"/>
@@ -30961,49 +30778,8 @@
           <w:sz w:val="28"/>
           <w:szCs w:val="28"/>
         </w:rPr>
-        <w:t xml:space="preserve">3.3 </w:t>
-      </w:r>
-      <w:r>
-        <w:rPr>
-          <w:sz w:val="28"/>
-          <w:szCs w:val="28"/>
-        </w:rPr>
-        <w:t>l</w:t>
-      </w:r>
-      <w:r>
-        <w:rPr>
-          <w:sz w:val="28"/>
-          <w:szCs w:val="28"/>
-        </w:rPr>
-        <w:t xml:space="preserve">àm sạch dữ liệu &amp; </w:t>
-      </w:r>
-      <w:r>
-        <w:rPr>
-          <w:sz w:val="28"/>
-          <w:szCs w:val="28"/>
-        </w:rPr>
-        <w:t>x</w:t>
-      </w:r>
-      <w:r>
-        <w:rPr>
-          <w:sz w:val="28"/>
-          <w:szCs w:val="28"/>
-        </w:rPr>
-        <w:t>ây dựng đặc trưng (</w:t>
-      </w:r>
-      <w:r>
-        <w:rPr>
-          <w:sz w:val="28"/>
-          <w:szCs w:val="28"/>
-        </w:rPr>
-        <w:t>m</w:t>
-      </w:r>
-      <w:r>
-        <w:rPr>
-          <w:sz w:val="28"/>
-          <w:szCs w:val="28"/>
-        </w:rPr>
-        <w:t>odule: cleaner.py)</w:t>
+        <w:lastRenderedPageBreak/>
+        <w:t>3.3 làm sạch dữ liệu &amp; xây dựng đặc trưng</w:t>
       </w:r>
     </w:p>
     <w:p>
@@ -31076,12 +30852,6 @@
         <w:gridCol w:w="2006"/>
       </w:tblGrid>
       <w:tr>
-        <w:tblPrEx>
-          <w:tblCellMar>
-            <w:top w:w="0" w:type="dxa"/>
-            <w:bottom w:w="0" w:type="dxa"/>
-          </w:tblCellMar>
-        </w:tblPrEx>
         <w:tc>
           <w:tcPr>
             <w:tcW w:w="600" w:type="dxa"/>
@@ -31216,12 +30986,6 @@
         </w:tc>
       </w:tr>
       <w:tr>
-        <w:tblPrEx>
-          <w:tblCellMar>
-            <w:top w:w="0" w:type="dxa"/>
-            <w:bottom w:w="0" w:type="dxa"/>
-          </w:tblCellMar>
-        </w:tblPrEx>
         <w:tc>
           <w:tcPr>
             <w:tcW w:w="600" w:type="dxa"/>
@@ -31342,12 +31106,6 @@
         </w:tc>
       </w:tr>
       <w:tr>
-        <w:tblPrEx>
-          <w:tblCellMar>
-            <w:top w:w="0" w:type="dxa"/>
-            <w:bottom w:w="0" w:type="dxa"/>
-          </w:tblCellMar>
-        </w:tblPrEx>
         <w:tc>
           <w:tcPr>
             <w:tcW w:w="600" w:type="dxa"/>
@@ -31468,12 +31226,6 @@
         </w:tc>
       </w:tr>
       <w:tr>
-        <w:tblPrEx>
-          <w:tblCellMar>
-            <w:top w:w="0" w:type="dxa"/>
-            <w:bottom w:w="0" w:type="dxa"/>
-          </w:tblCellMar>
-        </w:tblPrEx>
         <w:tc>
           <w:tcPr>
             <w:tcW w:w="600" w:type="dxa"/>
@@ -31594,12 +31346,6 @@
         </w:tc>
       </w:tr>
       <w:tr>
-        <w:tblPrEx>
-          <w:tblCellMar>
-            <w:top w:w="0" w:type="dxa"/>
-            <w:bottom w:w="0" w:type="dxa"/>
-          </w:tblCellMar>
-        </w:tblPrEx>
         <w:tc>
           <w:tcPr>
             <w:tcW w:w="600" w:type="dxa"/>
@@ -31720,12 +31466,6 @@
         </w:tc>
       </w:tr>
       <w:tr>
-        <w:tblPrEx>
-          <w:tblCellMar>
-            <w:top w:w="0" w:type="dxa"/>
-            <w:bottom w:w="0" w:type="dxa"/>
-          </w:tblCellMar>
-        </w:tblPrEx>
         <w:tc>
           <w:tcPr>
             <w:tcW w:w="600" w:type="dxa"/>
@@ -31846,12 +31586,6 @@
         </w:tc>
       </w:tr>
       <w:tr>
-        <w:tblPrEx>
-          <w:tblCellMar>
-            <w:top w:w="0" w:type="dxa"/>
-            <w:bottom w:w="0" w:type="dxa"/>
-          </w:tblCellMar>
-        </w:tblPrEx>
         <w:tc>
           <w:tcPr>
             <w:tcW w:w="600" w:type="dxa"/>
@@ -32006,7 +31740,7 @@
           <w:sz w:val="26"/>
           <w:szCs w:val="26"/>
         </w:rPr>
-        <w:t>huẩn hóa dữ liệu (clean_basic_anomalies)</w:t>
+        <w:t xml:space="preserve">huẩn hóa dữ liệu </w:t>
       </w:r>
     </w:p>
     <w:p>
@@ -32144,6 +31878,7 @@
           <w:sz w:val="19"/>
           <w:szCs w:val="19"/>
         </w:rPr>
+        <w:lastRenderedPageBreak/>
         <w:t># Đây là lỗi đã được phát hiện và sửa trong splitter.py + aggregate.py</w:t>
       </w:r>
     </w:p>
@@ -32180,7 +31915,6 @@
           <w:sz w:val="19"/>
           <w:szCs w:val="19"/>
         </w:rPr>
-        <w:lastRenderedPageBreak/>
         <w:t>junk_cols = ['row_id', '记录数', 'weeknum', 'market2', 'year']</w:t>
       </w:r>
     </w:p>
@@ -32419,7 +32153,7 @@
           <w:sz w:val="26"/>
           <w:szCs w:val="26"/>
         </w:rPr>
-        <w:t>ây dựng đặc trưng mới (engineer_features)</w:t>
+        <w:t xml:space="preserve">ây dựng đặc trưng mới </w:t>
       </w:r>
     </w:p>
     <w:p>
@@ -32450,12 +32184,6 @@
         <w:gridCol w:w="3953"/>
       </w:tblGrid>
       <w:tr>
-        <w:tblPrEx>
-          <w:tblCellMar>
-            <w:top w:w="0" w:type="dxa"/>
-            <w:bottom w:w="0" w:type="dxa"/>
-          </w:tblCellMar>
-        </w:tblPrEx>
         <w:tc>
           <w:tcPr>
             <w:tcW w:w="2400" w:type="dxa"/>
@@ -32557,12 +32285,6 @@
         </w:tc>
       </w:tr>
       <w:tr>
-        <w:tblPrEx>
-          <w:tblCellMar>
-            <w:top w:w="0" w:type="dxa"/>
-            <w:bottom w:w="0" w:type="dxa"/>
-          </w:tblCellMar>
-        </w:tblPrEx>
         <w:tc>
           <w:tcPr>
             <w:tcW w:w="2340" w:type="dxa"/>
@@ -32648,12 +32370,6 @@
         </w:tc>
       </w:tr>
       <w:tr>
-        <w:tblPrEx>
-          <w:tblCellMar>
-            <w:top w:w="0" w:type="dxa"/>
-            <w:bottom w:w="0" w:type="dxa"/>
-          </w:tblCellMar>
-        </w:tblPrEx>
         <w:tc>
           <w:tcPr>
             <w:tcW w:w="2340" w:type="dxa"/>
@@ -32739,12 +32455,6 @@
         </w:tc>
       </w:tr>
       <w:tr>
-        <w:tblPrEx>
-          <w:tblCellMar>
-            <w:top w:w="0" w:type="dxa"/>
-            <w:bottom w:w="0" w:type="dxa"/>
-          </w:tblCellMar>
-        </w:tblPrEx>
         <w:tc>
           <w:tcPr>
             <w:tcW w:w="2340" w:type="dxa"/>
@@ -32830,12 +32540,6 @@
         </w:tc>
       </w:tr>
       <w:tr>
-        <w:tblPrEx>
-          <w:tblCellMar>
-            <w:top w:w="0" w:type="dxa"/>
-            <w:bottom w:w="0" w:type="dxa"/>
-          </w:tblCellMar>
-        </w:tblPrEx>
         <w:tc>
           <w:tcPr>
             <w:tcW w:w="2340" w:type="dxa"/>
@@ -32861,6 +32565,7 @@
                 <w:sz w:val="22"/>
                 <w:szCs w:val="22"/>
               </w:rPr>
+              <w:lastRenderedPageBreak/>
               <w:t>order_quarter</w:t>
             </w:r>
           </w:p>
@@ -32953,7 +32658,6 @@
           <w:sz w:val="19"/>
           <w:szCs w:val="19"/>
         </w:rPr>
-        <w:lastRenderedPageBreak/>
         <w:t xml:space="preserve">    df['profit_margin']   = df['profit'] / df['sales'].replace(0, float('nan'))</w:t>
       </w:r>
     </w:p>
@@ -33080,7 +32784,7 @@
           <w:sz w:val="26"/>
           <w:szCs w:val="26"/>
         </w:rPr>
-        <w:t>nalysis (create_cohort_features)</w:t>
+        <w:t xml:space="preserve">nalysis </w:t>
       </w:r>
     </w:p>
     <w:p>
@@ -33123,12 +32827,6 @@
         <w:gridCol w:w="3013"/>
       </w:tblGrid>
       <w:tr>
-        <w:tblPrEx>
-          <w:tblCellMar>
-            <w:top w:w="0" w:type="dxa"/>
-            <w:bottom w:w="0" w:type="dxa"/>
-          </w:tblCellMar>
-        </w:tblPrEx>
         <w:tc>
           <w:tcPr>
             <w:tcW w:w="2400" w:type="dxa"/>
@@ -33230,12 +32928,6 @@
         </w:tc>
       </w:tr>
       <w:tr>
-        <w:tblPrEx>
-          <w:tblCellMar>
-            <w:top w:w="0" w:type="dxa"/>
-            <w:bottom w:w="0" w:type="dxa"/>
-          </w:tblCellMar>
-        </w:tblPrEx>
         <w:tc>
           <w:tcPr>
             <w:tcW w:w="2340" w:type="dxa"/>
@@ -33319,12 +33011,6 @@
         </w:tc>
       </w:tr>
       <w:tr>
-        <w:tblPrEx>
-          <w:tblCellMar>
-            <w:top w:w="0" w:type="dxa"/>
-            <w:bottom w:w="0" w:type="dxa"/>
-          </w:tblCellMar>
-        </w:tblPrEx>
         <w:tc>
           <w:tcPr>
             <w:tcW w:w="2340" w:type="dxa"/>
@@ -33408,12 +33094,6 @@
         </w:tc>
       </w:tr>
       <w:tr>
-        <w:tblPrEx>
-          <w:tblCellMar>
-            <w:top w:w="0" w:type="dxa"/>
-            <w:bottom w:w="0" w:type="dxa"/>
-          </w:tblCellMar>
-        </w:tblPrEx>
         <w:tc>
           <w:tcPr>
             <w:tcW w:w="2340" w:type="dxa"/>
@@ -33702,7 +33382,7 @@
           <w:sz w:val="26"/>
           <w:szCs w:val="26"/>
         </w:rPr>
-        <w:t>ase (calculate_rfm_base)</w:t>
+        <w:t xml:space="preserve">ase </w:t>
       </w:r>
     </w:p>
     <w:p>
@@ -33746,12 +33426,6 @@
         <w:gridCol w:w="2011"/>
       </w:tblGrid>
       <w:tr>
-        <w:tblPrEx>
-          <w:tblCellMar>
-            <w:top w:w="0" w:type="dxa"/>
-            <w:bottom w:w="0" w:type="dxa"/>
-          </w:tblCellMar>
-        </w:tblPrEx>
         <w:tc>
           <w:tcPr>
             <w:tcW w:w="1200" w:type="dxa"/>
@@ -33886,12 +33560,6 @@
         </w:tc>
       </w:tr>
       <w:tr>
-        <w:tblPrEx>
-          <w:tblCellMar>
-            <w:top w:w="0" w:type="dxa"/>
-            <w:bottom w:w="0" w:type="dxa"/>
-          </w:tblCellMar>
-        </w:tblPrEx>
         <w:tc>
           <w:tcPr>
             <w:tcW w:w="2340" w:type="dxa"/>
@@ -34007,12 +33675,6 @@
         </w:tc>
       </w:tr>
       <w:tr>
-        <w:tblPrEx>
-          <w:tblCellMar>
-            <w:top w:w="0" w:type="dxa"/>
-            <w:bottom w:w="0" w:type="dxa"/>
-          </w:tblCellMar>
-        </w:tblPrEx>
         <w:tc>
           <w:tcPr>
             <w:tcW w:w="2340" w:type="dxa"/>
@@ -34128,12 +33790,6 @@
         </w:tc>
       </w:tr>
       <w:tr>
-        <w:tblPrEx>
-          <w:tblCellMar>
-            <w:top w:w="0" w:type="dxa"/>
-            <w:bottom w:w="0" w:type="dxa"/>
-          </w:tblCellMar>
-        </w:tblPrEx>
         <w:tc>
           <w:tcPr>
             <w:tcW w:w="2340" w:type="dxa"/>
@@ -34485,12 +34141,6 @@
         <w:gridCol w:w="3013"/>
       </w:tblGrid>
       <w:tr>
-        <w:tblPrEx>
-          <w:tblCellMar>
-            <w:top w:w="0" w:type="dxa"/>
-            <w:bottom w:w="0" w:type="dxa"/>
-          </w:tblCellMar>
-        </w:tblPrEx>
         <w:tc>
           <w:tcPr>
             <w:tcW w:w="3000" w:type="dxa"/>
@@ -34592,12 +34242,6 @@
         </w:tc>
       </w:tr>
       <w:tr>
-        <w:tblPrEx>
-          <w:tblCellMar>
-            <w:top w:w="0" w:type="dxa"/>
-            <w:bottom w:w="0" w:type="dxa"/>
-          </w:tblCellMar>
-        </w:tblPrEx>
         <w:tc>
           <w:tcPr>
             <w:tcW w:w="2340" w:type="dxa"/>
@@ -34681,12 +34325,6 @@
         </w:tc>
       </w:tr>
       <w:tr>
-        <w:tblPrEx>
-          <w:tblCellMar>
-            <w:top w:w="0" w:type="dxa"/>
-            <w:bottom w:w="0" w:type="dxa"/>
-          </w:tblCellMar>
-        </w:tblPrEx>
         <w:tc>
           <w:tcPr>
             <w:tcW w:w="2340" w:type="dxa"/>
@@ -34710,6 +34348,7 @@
                 <w:sz w:val="22"/>
                 <w:szCs w:val="22"/>
               </w:rPr>
+              <w:lastRenderedPageBreak/>
               <w:t>Số cột</w:t>
             </w:r>
           </w:p>
@@ -34770,12 +34409,6 @@
         </w:tc>
       </w:tr>
       <w:tr>
-        <w:tblPrEx>
-          <w:tblCellMar>
-            <w:top w:w="0" w:type="dxa"/>
-            <w:bottom w:w="0" w:type="dxa"/>
-          </w:tblCellMar>
-        </w:tblPrEx>
         <w:tc>
           <w:tcPr>
             <w:tcW w:w="2340" w:type="dxa"/>
@@ -34859,12 +34492,6 @@
         </w:tc>
       </w:tr>
       <w:tr>
-        <w:tblPrEx>
-          <w:tblCellMar>
-            <w:top w:w="0" w:type="dxa"/>
-            <w:bottom w:w="0" w:type="dxa"/>
-          </w:tblCellMar>
-        </w:tblPrEx>
         <w:tc>
           <w:tcPr>
             <w:tcW w:w="2340" w:type="dxa"/>
@@ -34948,12 +34575,6 @@
         </w:tc>
       </w:tr>
       <w:tr>
-        <w:tblPrEx>
-          <w:tblCellMar>
-            <w:top w:w="0" w:type="dxa"/>
-            <w:bottom w:w="0" w:type="dxa"/>
-          </w:tblCellMar>
-        </w:tblPrEx>
         <w:tc>
           <w:tcPr>
             <w:tcW w:w="2340" w:type="dxa"/>
@@ -34977,7 +34598,6 @@
                 <w:sz w:val="22"/>
                 <w:szCs w:val="22"/>
               </w:rPr>
-              <w:lastRenderedPageBreak/>
               <w:t>File xuất</w:t>
             </w:r>
           </w:p>
@@ -35054,91 +34674,49 @@
           <w:sz w:val="28"/>
           <w:szCs w:val="28"/>
         </w:rPr>
-        <w:t xml:space="preserve">3.4 </w:t>
+        <w:t xml:space="preserve">3.4 xây dựng mô hình </w:t>
       </w:r>
       <w:r>
         <w:rPr>
           <w:sz w:val="28"/>
           <w:szCs w:val="28"/>
         </w:rPr>
-        <w:t>x</w:t>
+        <w:t>d</w:t>
       </w:r>
       <w:r>
         <w:rPr>
           <w:sz w:val="28"/>
           <w:szCs w:val="28"/>
         </w:rPr>
-        <w:t xml:space="preserve">ây dựng </w:t>
+        <w:t xml:space="preserve">ữ liệu </w:t>
       </w:r>
       <w:r>
         <w:rPr>
           <w:sz w:val="28"/>
           <w:szCs w:val="28"/>
         </w:rPr>
-        <w:t>m</w:t>
+        <w:t>s</w:t>
       </w:r>
       <w:r>
         <w:rPr>
           <w:sz w:val="28"/>
           <w:szCs w:val="28"/>
         </w:rPr>
-        <w:t xml:space="preserve">ô hình </w:t>
+        <w:t xml:space="preserve">tar </w:t>
       </w:r>
       <w:r>
         <w:rPr>
           <w:sz w:val="28"/>
           <w:szCs w:val="28"/>
         </w:rPr>
-        <w:t>d</w:t>
+        <w:t>s</w:t>
       </w:r>
       <w:r>
         <w:rPr>
           <w:sz w:val="28"/>
           <w:szCs w:val="28"/>
         </w:rPr>
-        <w:t xml:space="preserve">ữ liệu </w:t>
-      </w:r>
-      <w:r>
-        <w:rPr>
-          <w:sz w:val="28"/>
-          <w:szCs w:val="28"/>
-        </w:rPr>
-        <w:t>s</w:t>
-      </w:r>
-      <w:r>
-        <w:rPr>
-          <w:sz w:val="28"/>
-          <w:szCs w:val="28"/>
-        </w:rPr>
-        <w:t xml:space="preserve">tar </w:t>
-      </w:r>
-      <w:r>
-        <w:rPr>
-          <w:sz w:val="28"/>
-          <w:szCs w:val="28"/>
-        </w:rPr>
-        <w:t>s</w:t>
-      </w:r>
-      <w:r>
-        <w:rPr>
-          <w:sz w:val="28"/>
-          <w:szCs w:val="28"/>
-        </w:rPr>
-        <w:t>chema (</w:t>
-      </w:r>
-      <w:r>
-        <w:rPr>
-          <w:sz w:val="28"/>
-          <w:szCs w:val="28"/>
-        </w:rPr>
-        <w:t>m</w:t>
-      </w:r>
-      <w:r>
-        <w:rPr>
-          <w:sz w:val="28"/>
-          <w:szCs w:val="28"/>
-        </w:rPr>
-        <w:t>odule: splitter.py)</w:t>
+        <w:t>chema</w:t>
       </w:r>
     </w:p>
     <w:p>
@@ -35211,12 +34789,6 @@
         <w:gridCol w:w="9026"/>
       </w:tblGrid>
       <w:tr>
-        <w:tblPrEx>
-          <w:tblCellMar>
-            <w:top w:w="0" w:type="dxa"/>
-            <w:bottom w:w="0" w:type="dxa"/>
-          </w:tblCellMar>
-        </w:tblPrEx>
         <w:tc>
           <w:tcPr>
             <w:tcW w:w="9026" w:type="dxa"/>
@@ -35395,12 +34967,6 @@
         <w:gridCol w:w="2132"/>
       </w:tblGrid>
       <w:tr>
-        <w:tblPrEx>
-          <w:tblCellMar>
-            <w:top w:w="0" w:type="dxa"/>
-            <w:bottom w:w="0" w:type="dxa"/>
-          </w:tblCellMar>
-        </w:tblPrEx>
         <w:tc>
           <w:tcPr>
             <w:tcW w:w="2400" w:type="dxa"/>
@@ -35568,12 +35134,6 @@
         </w:tc>
       </w:tr>
       <w:tr>
-        <w:tblPrEx>
-          <w:tblCellMar>
-            <w:top w:w="0" w:type="dxa"/>
-            <w:bottom w:w="0" w:type="dxa"/>
-          </w:tblCellMar>
-        </w:tblPrEx>
         <w:tc>
           <w:tcPr>
             <w:tcW w:w="2340" w:type="dxa"/>
@@ -35721,12 +35281,6 @@
         </w:tc>
       </w:tr>
       <w:tr>
-        <w:tblPrEx>
-          <w:tblCellMar>
-            <w:top w:w="0" w:type="dxa"/>
-            <w:bottom w:w="0" w:type="dxa"/>
-          </w:tblCellMar>
-        </w:tblPrEx>
         <w:tc>
           <w:tcPr>
             <w:tcW w:w="2340" w:type="dxa"/>
@@ -35874,12 +35428,6 @@
         </w:tc>
       </w:tr>
       <w:tr>
-        <w:tblPrEx>
-          <w:tblCellMar>
-            <w:top w:w="0" w:type="dxa"/>
-            <w:bottom w:w="0" w:type="dxa"/>
-          </w:tblCellMar>
-        </w:tblPrEx>
         <w:tc>
           <w:tcPr>
             <w:tcW w:w="2340" w:type="dxa"/>
@@ -36027,12 +35575,6 @@
         </w:tc>
       </w:tr>
       <w:tr>
-        <w:tblPrEx>
-          <w:tblCellMar>
-            <w:top w:w="0" w:type="dxa"/>
-            <w:bottom w:w="0" w:type="dxa"/>
-          </w:tblCellMar>
-        </w:tblPrEx>
         <w:tc>
           <w:tcPr>
             <w:tcW w:w="2340" w:type="dxa"/>
@@ -36058,6 +35600,7 @@
                 <w:sz w:val="22"/>
                 <w:szCs w:val="22"/>
               </w:rPr>
+              <w:lastRenderedPageBreak/>
               <w:t>dim_time</w:t>
             </w:r>
           </w:p>
@@ -36180,12 +35723,6 @@
         </w:tc>
       </w:tr>
       <w:tr>
-        <w:tblPrEx>
-          <w:tblCellMar>
-            <w:top w:w="0" w:type="dxa"/>
-            <w:bottom w:w="0" w:type="dxa"/>
-          </w:tblCellMar>
-        </w:tblPrEx>
         <w:tc>
           <w:tcPr>
             <w:tcW w:w="2340" w:type="dxa"/>
@@ -36645,6 +36182,7 @@
           <w:sz w:val="19"/>
           <w:szCs w:val="19"/>
         </w:rPr>
+        <w:lastRenderedPageBreak/>
         <w:t>dim['quarter']    = dim['date'].dt.quarter</w:t>
       </w:r>
     </w:p>
@@ -36737,63 +36275,7 @@
           <w:sz w:val="28"/>
           <w:szCs w:val="28"/>
         </w:rPr>
-        <w:t xml:space="preserve">3.5 </w:t>
-      </w:r>
-      <w:r>
-        <w:rPr>
-          <w:sz w:val="28"/>
-          <w:szCs w:val="28"/>
-        </w:rPr>
-        <w:t>t</w:t>
-      </w:r>
-      <w:r>
-        <w:rPr>
-          <w:sz w:val="28"/>
-          <w:szCs w:val="28"/>
-        </w:rPr>
-        <w:t xml:space="preserve">ạo bảng tổng hợp </w:t>
-      </w:r>
-      <w:r>
-        <w:rPr>
-          <w:sz w:val="28"/>
-          <w:szCs w:val="28"/>
-        </w:rPr>
-        <w:t>d</w:t>
-      </w:r>
-      <w:r>
-        <w:rPr>
-          <w:sz w:val="28"/>
-          <w:szCs w:val="28"/>
-        </w:rPr>
-        <w:t xml:space="preserve">ata </w:t>
-      </w:r>
-      <w:r>
-        <w:rPr>
-          <w:sz w:val="28"/>
-          <w:szCs w:val="28"/>
-        </w:rPr>
-        <w:t>m</w:t>
-      </w:r>
-      <w:r>
-        <w:rPr>
-          <w:sz w:val="28"/>
-          <w:szCs w:val="28"/>
-        </w:rPr>
-        <w:t>arts (</w:t>
-      </w:r>
-      <w:r>
-        <w:rPr>
-          <w:sz w:val="28"/>
-          <w:szCs w:val="28"/>
-        </w:rPr>
-        <w:t>m</w:t>
-      </w:r>
-      <w:r>
-        <w:rPr>
-          <w:sz w:val="28"/>
-          <w:szCs w:val="28"/>
-        </w:rPr>
-        <w:t>odule: aggregate.py)</w:t>
+        <w:t xml:space="preserve">3.5 tạo bảng tổng hợp data marts </w:t>
       </w:r>
     </w:p>
     <w:p>
@@ -36866,12 +36348,6 @@
         <w:gridCol w:w="9026"/>
       </w:tblGrid>
       <w:tr>
-        <w:tblPrEx>
-          <w:tblCellMar>
-            <w:top w:w="0" w:type="dxa"/>
-            <w:bottom w:w="0" w:type="dxa"/>
-          </w:tblCellMar>
-        </w:tblPrEx>
         <w:tc>
           <w:tcPr>
             <w:tcW w:w="9026" w:type="dxa"/>
@@ -37060,12 +36536,6 @@
         <w:gridCol w:w="9026"/>
       </w:tblGrid>
       <w:tr>
-        <w:tblPrEx>
-          <w:tblCellMar>
-            <w:top w:w="0" w:type="dxa"/>
-            <w:bottom w:w="0" w:type="dxa"/>
-          </w:tblCellMar>
-        </w:tblPrEx>
         <w:tc>
           <w:tcPr>
             <w:tcW w:w="9026" w:type="dxa"/>
@@ -37177,6 +36647,7 @@
           <w:sz w:val="19"/>
           <w:szCs w:val="19"/>
         </w:rPr>
+        <w:lastRenderedPageBreak/>
         <w:t>rfm['m_score'] = pd.qcut(rfm['monetary'], 5, labels=[1,2,3,4,5])  # Cao = 5</w:t>
       </w:r>
     </w:p>
@@ -37225,12 +36696,6 @@
         <w:gridCol w:w="1864"/>
       </w:tblGrid>
       <w:tr>
-        <w:tblPrEx>
-          <w:tblCellMar>
-            <w:top w:w="0" w:type="dxa"/>
-            <w:bottom w:w="0" w:type="dxa"/>
-          </w:tblCellMar>
-        </w:tblPrEx>
         <w:tc>
           <w:tcPr>
             <w:tcW w:w="2800" w:type="dxa"/>
@@ -37398,12 +36863,6 @@
         </w:tc>
       </w:tr>
       <w:tr>
-        <w:tblPrEx>
-          <w:tblCellMar>
-            <w:top w:w="0" w:type="dxa"/>
-            <w:bottom w:w="0" w:type="dxa"/>
-          </w:tblCellMar>
-        </w:tblPrEx>
         <w:tc>
           <w:tcPr>
             <w:tcW w:w="2340" w:type="dxa"/>
@@ -37548,12 +37007,6 @@
         </w:tc>
       </w:tr>
       <w:tr>
-        <w:tblPrEx>
-          <w:tblCellMar>
-            <w:top w:w="0" w:type="dxa"/>
-            <w:bottom w:w="0" w:type="dxa"/>
-          </w:tblCellMar>
-        </w:tblPrEx>
         <w:tc>
           <w:tcPr>
             <w:tcW w:w="2340" w:type="dxa"/>
@@ -37696,12 +37149,6 @@
         </w:tc>
       </w:tr>
       <w:tr>
-        <w:tblPrEx>
-          <w:tblCellMar>
-            <w:top w:w="0" w:type="dxa"/>
-            <w:bottom w:w="0" w:type="dxa"/>
-          </w:tblCellMar>
-        </w:tblPrEx>
         <w:tc>
           <w:tcPr>
             <w:tcW w:w="2340" w:type="dxa"/>
@@ -37844,12 +37291,6 @@
         </w:tc>
       </w:tr>
       <w:tr>
-        <w:tblPrEx>
-          <w:tblCellMar>
-            <w:top w:w="0" w:type="dxa"/>
-            <w:bottom w:w="0" w:type="dxa"/>
-          </w:tblCellMar>
-        </w:tblPrEx>
         <w:tc>
           <w:tcPr>
             <w:tcW w:w="2340" w:type="dxa"/>
@@ -37994,12 +37435,6 @@
         </w:tc>
       </w:tr>
       <w:tr>
-        <w:tblPrEx>
-          <w:tblCellMar>
-            <w:top w:w="0" w:type="dxa"/>
-            <w:bottom w:w="0" w:type="dxa"/>
-          </w:tblCellMar>
-        </w:tblPrEx>
         <w:tc>
           <w:tcPr>
             <w:tcW w:w="2340" w:type="dxa"/>
@@ -38142,12 +37577,6 @@
         </w:tc>
       </w:tr>
       <w:tr>
-        <w:tblPrEx>
-          <w:tblCellMar>
-            <w:top w:w="0" w:type="dxa"/>
-            <w:bottom w:w="0" w:type="dxa"/>
-          </w:tblCellMar>
-        </w:tblPrEx>
         <w:tc>
           <w:tcPr>
             <w:tcW w:w="2340" w:type="dxa"/>
@@ -38318,12 +37747,6 @@
         <w:gridCol w:w="9026"/>
       </w:tblGrid>
       <w:tr>
-        <w:tblPrEx>
-          <w:tblCellMar>
-            <w:top w:w="0" w:type="dxa"/>
-            <w:bottom w:w="0" w:type="dxa"/>
-          </w:tblCellMar>
-        </w:tblPrEx>
         <w:tc>
           <w:tcPr>
             <w:tcW w:w="9026" w:type="dxa"/>
@@ -38399,12 +37822,6 @@
         <w:gridCol w:w="9026"/>
       </w:tblGrid>
       <w:tr>
-        <w:tblPrEx>
-          <w:tblCellMar>
-            <w:top w:w="0" w:type="dxa"/>
-            <w:bottom w:w="0" w:type="dxa"/>
-          </w:tblCellMar>
-        </w:tblPrEx>
         <w:tc>
           <w:tcPr>
             <w:tcW w:w="9026" w:type="dxa"/>
@@ -38481,6 +37898,7 @@
           <w:sz w:val="19"/>
           <w:szCs w:val="19"/>
         </w:rPr>
+        <w:lastRenderedPageBreak/>
         <w:t>pivot = cohort_data.pivot(index='cohort_month', columns='cohort_index', values='customer_id')</w:t>
       </w:r>
     </w:p>
@@ -38600,12 +38018,6 @@
         <w:gridCol w:w="9026"/>
       </w:tblGrid>
       <w:tr>
-        <w:tblPrEx>
-          <w:tblCellMar>
-            <w:top w:w="0" w:type="dxa"/>
-            <w:bottom w:w="0" w:type="dxa"/>
-          </w:tblCellMar>
-        </w:tblPrEx>
         <w:tc>
           <w:tcPr>
             <w:tcW w:w="9026" w:type="dxa"/>
@@ -38686,12 +38098,6 @@
         <w:gridCol w:w="1411"/>
       </w:tblGrid>
       <w:tr>
-        <w:tblPrEx>
-          <w:tblCellMar>
-            <w:top w:w="0" w:type="dxa"/>
-            <w:bottom w:w="0" w:type="dxa"/>
-          </w:tblCellMar>
-        </w:tblPrEx>
         <w:tc>
           <w:tcPr>
             <w:tcW w:w="2000" w:type="dxa"/>
@@ -38892,12 +38298,6 @@
         </w:tc>
       </w:tr>
       <w:tr>
-        <w:tblPrEx>
-          <w:tblCellMar>
-            <w:top w:w="0" w:type="dxa"/>
-            <w:bottom w:w="0" w:type="dxa"/>
-          </w:tblCellMar>
-        </w:tblPrEx>
         <w:tc>
           <w:tcPr>
             <w:tcW w:w="2340" w:type="dxa"/>
@@ -39079,12 +38479,6 @@
         </w:tc>
       </w:tr>
       <w:tr>
-        <w:tblPrEx>
-          <w:tblCellMar>
-            <w:top w:w="0" w:type="dxa"/>
-            <w:bottom w:w="0" w:type="dxa"/>
-          </w:tblCellMar>
-        </w:tblPrEx>
         <w:tc>
           <w:tcPr>
             <w:tcW w:w="2340" w:type="dxa"/>
@@ -39264,12 +38658,6 @@
         </w:tc>
       </w:tr>
       <w:tr>
-        <w:tblPrEx>
-          <w:tblCellMar>
-            <w:top w:w="0" w:type="dxa"/>
-            <w:bottom w:w="0" w:type="dxa"/>
-          </w:tblCellMar>
-        </w:tblPrEx>
         <w:tc>
           <w:tcPr>
             <w:tcW w:w="2340" w:type="dxa"/>
@@ -39449,12 +38837,6 @@
         </w:tc>
       </w:tr>
       <w:tr>
-        <w:tblPrEx>
-          <w:tblCellMar>
-            <w:top w:w="0" w:type="dxa"/>
-            <w:bottom w:w="0" w:type="dxa"/>
-          </w:tblCellMar>
-        </w:tblPrEx>
         <w:tc>
           <w:tcPr>
             <w:tcW w:w="2340" w:type="dxa"/>
@@ -39629,12 +39011,6 @@
         </w:tc>
       </w:tr>
       <w:tr>
-        <w:tblPrEx>
-          <w:tblCellMar>
-            <w:top w:w="0" w:type="dxa"/>
-            <w:bottom w:w="0" w:type="dxa"/>
-          </w:tblCellMar>
-        </w:tblPrEx>
         <w:tc>
           <w:tcPr>
             <w:tcW w:w="2340" w:type="dxa"/>
@@ -39809,12 +39185,6 @@
         </w:tc>
       </w:tr>
       <w:tr>
-        <w:tblPrEx>
-          <w:tblCellMar>
-            <w:top w:w="0" w:type="dxa"/>
-            <w:bottom w:w="0" w:type="dxa"/>
-          </w:tblCellMar>
-        </w:tblPrEx>
         <w:tc>
           <w:tcPr>
             <w:tcW w:w="2340" w:type="dxa"/>
@@ -39989,12 +39359,6 @@
         </w:tc>
       </w:tr>
       <w:tr>
-        <w:tblPrEx>
-          <w:tblCellMar>
-            <w:top w:w="0" w:type="dxa"/>
-            <w:bottom w:w="0" w:type="dxa"/>
-          </w:tblCellMar>
-        </w:tblPrEx>
         <w:tc>
           <w:tcPr>
             <w:tcW w:w="2340" w:type="dxa"/>
@@ -40169,12 +39533,6 @@
         </w:tc>
       </w:tr>
       <w:tr>
-        <w:tblPrEx>
-          <w:tblCellMar>
-            <w:top w:w="0" w:type="dxa"/>
-            <w:bottom w:w="0" w:type="dxa"/>
-          </w:tblCellMar>
-        </w:tblPrEx>
         <w:tc>
           <w:tcPr>
             <w:tcW w:w="2340" w:type="dxa"/>
@@ -40375,12 +39733,6 @@
         <w:gridCol w:w="9026"/>
       </w:tblGrid>
       <w:tr>
-        <w:tblPrEx>
-          <w:tblCellMar>
-            <w:top w:w="0" w:type="dxa"/>
-            <w:bottom w:w="0" w:type="dxa"/>
-          </w:tblCellMar>
-        </w:tblPrEx>
         <w:tc>
           <w:tcPr>
             <w:tcW w:w="9026" w:type="dxa"/>
@@ -40407,7 +39759,27 @@
                 <w:sz w:val="22"/>
                 <w:szCs w:val="22"/>
               </w:rPr>
-              <w:t>Data Mart 4: agg_yoy_growth.csv — Tăng trưởng YoY ★ Mới</w:t>
+              <w:t xml:space="preserve">Data Mart 4: agg_yoy_growth.csv — Tăng trưởng YoY </w:t>
+            </w:r>
+            <w:r>
+              <w:rPr>
+                <w:b/>
+                <w:bCs/>
+                <w:color w:val="1F4E79"/>
+                <w:sz w:val="22"/>
+                <w:szCs w:val="22"/>
+              </w:rPr>
+              <w:t>m</w:t>
+            </w:r>
+            <w:r>
+              <w:rPr>
+                <w:b/>
+                <w:bCs/>
+                <w:color w:val="1F4E79"/>
+                <w:sz w:val="22"/>
+                <w:szCs w:val="22"/>
+              </w:rPr>
+              <w:t>ới</w:t>
             </w:r>
           </w:p>
         </w:tc>
@@ -40444,12 +39816,6 @@
         <w:gridCol w:w="1566"/>
       </w:tblGrid>
       <w:tr>
-        <w:tblPrEx>
-          <w:tblCellMar>
-            <w:top w:w="0" w:type="dxa"/>
-            <w:bottom w:w="0" w:type="dxa"/>
-          </w:tblCellMar>
-        </w:tblPrEx>
         <w:tc>
           <w:tcPr>
             <w:tcW w:w="900" w:type="dxa"/>
@@ -40479,6 +39845,7 @@
                 <w:sz w:val="22"/>
                 <w:szCs w:val="22"/>
               </w:rPr>
+              <w:lastRenderedPageBreak/>
               <w:t>Năm</w:t>
             </w:r>
           </w:p>
@@ -40650,12 +40017,6 @@
         </w:tc>
       </w:tr>
       <w:tr>
-        <w:tblPrEx>
-          <w:tblCellMar>
-            <w:top w:w="0" w:type="dxa"/>
-            <w:bottom w:w="0" w:type="dxa"/>
-          </w:tblCellMar>
-        </w:tblPrEx>
         <w:tc>
           <w:tcPr>
             <w:tcW w:w="2340" w:type="dxa"/>
@@ -40820,12 +40181,6 @@
         </w:tc>
       </w:tr>
       <w:tr>
-        <w:tblPrEx>
-          <w:tblCellMar>
-            <w:top w:w="0" w:type="dxa"/>
-            <w:bottom w:w="0" w:type="dxa"/>
-          </w:tblCellMar>
-        </w:tblPrEx>
         <w:tc>
           <w:tcPr>
             <w:tcW w:w="2340" w:type="dxa"/>
@@ -41000,12 +40355,6 @@
         </w:tc>
       </w:tr>
       <w:tr>
-        <w:tblPrEx>
-          <w:tblCellMar>
-            <w:top w:w="0" w:type="dxa"/>
-            <w:bottom w:w="0" w:type="dxa"/>
-          </w:tblCellMar>
-        </w:tblPrEx>
         <w:tc>
           <w:tcPr>
             <w:tcW w:w="2340" w:type="dxa"/>
@@ -41180,12 +40529,6 @@
         </w:tc>
       </w:tr>
       <w:tr>
-        <w:tblPrEx>
-          <w:tblCellMar>
-            <w:top w:w="0" w:type="dxa"/>
-            <w:bottom w:w="0" w:type="dxa"/>
-          </w:tblCellMar>
-        </w:tblPrEx>
         <w:tc>
           <w:tcPr>
             <w:tcW w:w="2340" w:type="dxa"/>
@@ -41390,12 +40733,6 @@
         <w:gridCol w:w="9026"/>
       </w:tblGrid>
       <w:tr>
-        <w:tblPrEx>
-          <w:tblCellMar>
-            <w:top w:w="0" w:type="dxa"/>
-            <w:bottom w:w="0" w:type="dxa"/>
-          </w:tblCellMar>
-        </w:tblPrEx>
         <w:tc>
           <w:tcPr>
             <w:tcW w:w="9026" w:type="dxa"/>
@@ -41471,12 +40808,6 @@
         <w:gridCol w:w="9026"/>
       </w:tblGrid>
       <w:tr>
-        <w:tblPrEx>
-          <w:tblCellMar>
-            <w:top w:w="0" w:type="dxa"/>
-            <w:bottom w:w="0" w:type="dxa"/>
-          </w:tblCellMar>
-        </w:tblPrEx>
         <w:tc>
           <w:tcPr>
             <w:tcW w:w="9026" w:type="dxa"/>
@@ -41503,7 +40834,7 @@
                 <w:sz w:val="22"/>
                 <w:szCs w:val="22"/>
               </w:rPr>
-              <w:t>Data Mart 5: agg_discount_impact.csv — Tác động Discount ★ Mới</w:t>
+              <w:t>Data Mart 5: agg_discount_impact.csv — Tác động Discount  Mới</w:t>
             </w:r>
           </w:p>
         </w:tc>
@@ -41539,12 +40870,6 @@
         <w:gridCol w:w="1934"/>
       </w:tblGrid>
       <w:tr>
-        <w:tblPrEx>
-          <w:tblCellMar>
-            <w:top w:w="0" w:type="dxa"/>
-            <w:bottom w:w="0" w:type="dxa"/>
-          </w:tblCellMar>
-        </w:tblPrEx>
         <w:tc>
           <w:tcPr>
             <w:tcW w:w="1800" w:type="dxa"/>
@@ -41712,12 +41037,6 @@
         </w:tc>
       </w:tr>
       <w:tr>
-        <w:tblPrEx>
-          <w:tblCellMar>
-            <w:top w:w="0" w:type="dxa"/>
-            <w:bottom w:w="0" w:type="dxa"/>
-          </w:tblCellMar>
-        </w:tblPrEx>
         <w:tc>
           <w:tcPr>
             <w:tcW w:w="2340" w:type="dxa"/>
@@ -41865,12 +41184,6 @@
         </w:tc>
       </w:tr>
       <w:tr>
-        <w:tblPrEx>
-          <w:tblCellMar>
-            <w:top w:w="0" w:type="dxa"/>
-            <w:bottom w:w="0" w:type="dxa"/>
-          </w:tblCellMar>
-        </w:tblPrEx>
         <w:tc>
           <w:tcPr>
             <w:tcW w:w="2340" w:type="dxa"/>
@@ -42018,12 +41331,6 @@
         </w:tc>
       </w:tr>
       <w:tr>
-        <w:tblPrEx>
-          <w:tblCellMar>
-            <w:top w:w="0" w:type="dxa"/>
-            <w:bottom w:w="0" w:type="dxa"/>
-          </w:tblCellMar>
-        </w:tblPrEx>
         <w:tc>
           <w:tcPr>
             <w:tcW w:w="2340" w:type="dxa"/>
@@ -42173,12 +41480,6 @@
         </w:tc>
       </w:tr>
       <w:tr>
-        <w:tblPrEx>
-          <w:tblCellMar>
-            <w:top w:w="0" w:type="dxa"/>
-            <w:bottom w:w="0" w:type="dxa"/>
-          </w:tblCellMar>
-        </w:tblPrEx>
         <w:tc>
           <w:tcPr>
             <w:tcW w:w="2340" w:type="dxa"/>
@@ -42354,12 +41655,6 @@
         <w:gridCol w:w="9026"/>
       </w:tblGrid>
       <w:tr>
-        <w:tblPrEx>
-          <w:tblCellMar>
-            <w:top w:w="0" w:type="dxa"/>
-            <w:bottom w:w="0" w:type="dxa"/>
-          </w:tblCellMar>
-        </w:tblPrEx>
         <w:tc>
           <w:tcPr>
             <w:tcW w:w="9026" w:type="dxa"/>
@@ -42401,6 +41696,7 @@
                 <w:sz w:val="22"/>
                 <w:szCs w:val="22"/>
               </w:rPr>
+              <w:lastRenderedPageBreak/>
               <w:t>Cài giới hạn tối đa discount = 30% vào hệ thống bán hàng. 4,172 đơn hàng discount 50%+ gây lỗ 100% — không có ngoại lệ. Mỗi đơn lỗ trung bình -98.89$. Tổng thiệt hại ước tính từ nhóm này: ~412,000$ trong 4 năm.</w:t>
             </w:r>
           </w:p>
@@ -42433,12 +41729,6 @@
         <w:gridCol w:w="9026"/>
       </w:tblGrid>
       <w:tr>
-        <w:tblPrEx>
-          <w:tblCellMar>
-            <w:top w:w="0" w:type="dxa"/>
-            <w:bottom w:w="0" w:type="dxa"/>
-          </w:tblCellMar>
-        </w:tblPrEx>
         <w:tc>
           <w:tcPr>
             <w:tcW w:w="9026" w:type="dxa"/>
@@ -42465,7 +41755,27 @@
                 <w:sz w:val="22"/>
                 <w:szCs w:val="22"/>
               </w:rPr>
-              <w:t>Data Mart 6: agg_shipping_analysis.csv — Phân tích giao hàng ★ Mới</w:t>
+              <w:t xml:space="preserve">Data Mart 6: agg_shipping_analysis.csv — Phân tích giao hàng </w:t>
+            </w:r>
+            <w:r>
+              <w:rPr>
+                <w:b/>
+                <w:bCs/>
+                <w:color w:val="1F4E79"/>
+                <w:sz w:val="22"/>
+                <w:szCs w:val="22"/>
+              </w:rPr>
+              <w:t>m</w:t>
+            </w:r>
+            <w:r>
+              <w:rPr>
+                <w:b/>
+                <w:bCs/>
+                <w:color w:val="1F4E79"/>
+                <w:sz w:val="22"/>
+                <w:szCs w:val="22"/>
+              </w:rPr>
+              <w:t>ới</w:t>
             </w:r>
           </w:p>
         </w:tc>
@@ -42500,12 +41810,6 @@
         <w:gridCol w:w="2154"/>
       </w:tblGrid>
       <w:tr>
-        <w:tblPrEx>
-          <w:tblCellMar>
-            <w:top w:w="0" w:type="dxa"/>
-            <w:bottom w:w="0" w:type="dxa"/>
-          </w:tblCellMar>
-        </w:tblPrEx>
         <w:tc>
           <w:tcPr>
             <w:tcW w:w="2800" w:type="dxa"/>
@@ -42640,12 +41944,6 @@
         </w:tc>
       </w:tr>
       <w:tr>
-        <w:tblPrEx>
-          <w:tblCellMar>
-            <w:top w:w="0" w:type="dxa"/>
-            <w:bottom w:w="0" w:type="dxa"/>
-          </w:tblCellMar>
-        </w:tblPrEx>
         <w:tc>
           <w:tcPr>
             <w:tcW w:w="2340" w:type="dxa"/>
@@ -42756,12 +42054,6 @@
         </w:tc>
       </w:tr>
       <w:tr>
-        <w:tblPrEx>
-          <w:tblCellMar>
-            <w:top w:w="0" w:type="dxa"/>
-            <w:bottom w:w="0" w:type="dxa"/>
-          </w:tblCellMar>
-        </w:tblPrEx>
         <w:tc>
           <w:tcPr>
             <w:tcW w:w="2340" w:type="dxa"/>
@@ -42874,12 +42166,6 @@
         </w:tc>
       </w:tr>
       <w:tr>
-        <w:tblPrEx>
-          <w:tblCellMar>
-            <w:top w:w="0" w:type="dxa"/>
-            <w:bottom w:w="0" w:type="dxa"/>
-          </w:tblCellMar>
-        </w:tblPrEx>
         <w:tc>
           <w:tcPr>
             <w:tcW w:w="2340" w:type="dxa"/>
@@ -42990,12 +42276,6 @@
         </w:tc>
       </w:tr>
       <w:tr>
-        <w:tblPrEx>
-          <w:tblCellMar>
-            <w:top w:w="0" w:type="dxa"/>
-            <w:bottom w:w="0" w:type="dxa"/>
-          </w:tblCellMar>
-        </w:tblPrEx>
         <w:tc>
           <w:tcPr>
             <w:tcW w:w="2340" w:type="dxa"/>
@@ -43134,12 +42414,6 @@
         <w:gridCol w:w="9026"/>
       </w:tblGrid>
       <w:tr>
-        <w:tblPrEx>
-          <w:tblCellMar>
-            <w:top w:w="0" w:type="dxa"/>
-            <w:bottom w:w="0" w:type="dxa"/>
-          </w:tblCellMar>
-        </w:tblPrEx>
         <w:tc>
           <w:tcPr>
             <w:tcW w:w="9026" w:type="dxa"/>
@@ -43166,7 +42440,27 @@
                 <w:sz w:val="22"/>
                 <w:szCs w:val="22"/>
               </w:rPr>
-              <w:t>Data Mart 7: agg_market_performance.csv — Hiệu suất 7 Markets ★ Mới</w:t>
+              <w:t xml:space="preserve">Data Mart 7: agg_market_performance.csv — Hiệu suất 7 Markets </w:t>
+            </w:r>
+            <w:r>
+              <w:rPr>
+                <w:b/>
+                <w:bCs/>
+                <w:color w:val="1F4E79"/>
+                <w:sz w:val="22"/>
+                <w:szCs w:val="22"/>
+              </w:rPr>
+              <w:t>m</w:t>
+            </w:r>
+            <w:r>
+              <w:rPr>
+                <w:b/>
+                <w:bCs/>
+                <w:color w:val="1F4E79"/>
+                <w:sz w:val="22"/>
+                <w:szCs w:val="22"/>
+              </w:rPr>
+              <w:t>ới</w:t>
             </w:r>
           </w:p>
         </w:tc>
@@ -43202,12 +42496,6 @@
         <w:gridCol w:w="1766"/>
       </w:tblGrid>
       <w:tr>
-        <w:tblPrEx>
-          <w:tblCellMar>
-            <w:top w:w="0" w:type="dxa"/>
-            <w:bottom w:w="0" w:type="dxa"/>
-          </w:tblCellMar>
-        </w:tblPrEx>
         <w:tc>
           <w:tcPr>
             <w:tcW w:w="1600" w:type="dxa"/>
@@ -43375,12 +42663,6 @@
         </w:tc>
       </w:tr>
       <w:tr>
-        <w:tblPrEx>
-          <w:tblCellMar>
-            <w:top w:w="0" w:type="dxa"/>
-            <w:bottom w:w="0" w:type="dxa"/>
-          </w:tblCellMar>
-        </w:tblPrEx>
         <w:tc>
           <w:tcPr>
             <w:tcW w:w="2340" w:type="dxa"/>
@@ -43521,12 +42803,6 @@
         </w:tc>
       </w:tr>
       <w:tr>
-        <w:tblPrEx>
-          <w:tblCellMar>
-            <w:top w:w="0" w:type="dxa"/>
-            <w:bottom w:w="0" w:type="dxa"/>
-          </w:tblCellMar>
-        </w:tblPrEx>
         <w:tc>
           <w:tcPr>
             <w:tcW w:w="2340" w:type="dxa"/>
@@ -43667,12 +42943,6 @@
         </w:tc>
       </w:tr>
       <w:tr>
-        <w:tblPrEx>
-          <w:tblCellMar>
-            <w:top w:w="0" w:type="dxa"/>
-            <w:bottom w:w="0" w:type="dxa"/>
-          </w:tblCellMar>
-        </w:tblPrEx>
         <w:tc>
           <w:tcPr>
             <w:tcW w:w="2340" w:type="dxa"/>
@@ -43813,12 +43083,6 @@
         </w:tc>
       </w:tr>
       <w:tr>
-        <w:tblPrEx>
-          <w:tblCellMar>
-            <w:top w:w="0" w:type="dxa"/>
-            <w:bottom w:w="0" w:type="dxa"/>
-          </w:tblCellMar>
-        </w:tblPrEx>
         <w:tc>
           <w:tcPr>
             <w:tcW w:w="2340" w:type="dxa"/>
@@ -43959,12 +43223,6 @@
         </w:tc>
       </w:tr>
       <w:tr>
-        <w:tblPrEx>
-          <w:tblCellMar>
-            <w:top w:w="0" w:type="dxa"/>
-            <w:bottom w:w="0" w:type="dxa"/>
-          </w:tblCellMar>
-        </w:tblPrEx>
         <w:tc>
           <w:tcPr>
             <w:tcW w:w="2340" w:type="dxa"/>
@@ -43988,6 +43246,7 @@
                 <w:sz w:val="22"/>
                 <w:szCs w:val="22"/>
               </w:rPr>
+              <w:lastRenderedPageBreak/>
               <w:t>Africa</w:t>
             </w:r>
           </w:p>
@@ -44105,12 +43364,6 @@
         </w:tc>
       </w:tr>
       <w:tr>
-        <w:tblPrEx>
-          <w:tblCellMar>
-            <w:top w:w="0" w:type="dxa"/>
-            <w:bottom w:w="0" w:type="dxa"/>
-          </w:tblCellMar>
-        </w:tblPrEx>
         <w:tc>
           <w:tcPr>
             <w:tcW w:w="2340" w:type="dxa"/>
@@ -44255,12 +43508,6 @@
         </w:tc>
       </w:tr>
       <w:tr>
-        <w:tblPrEx>
-          <w:tblCellMar>
-            <w:top w:w="0" w:type="dxa"/>
-            <w:bottom w:w="0" w:type="dxa"/>
-          </w:tblCellMar>
-        </w:tblPrEx>
         <w:tc>
           <w:tcPr>
             <w:tcW w:w="2340" w:type="dxa"/>
@@ -44431,12 +43678,6 @@
         <w:gridCol w:w="9026"/>
       </w:tblGrid>
       <w:tr>
-        <w:tblPrEx>
-          <w:tblCellMar>
-            <w:top w:w="0" w:type="dxa"/>
-            <w:bottom w:w="0" w:type="dxa"/>
-          </w:tblCellMar>
-        </w:tblPrEx>
         <w:tc>
           <w:tcPr>
             <w:tcW w:w="9026" w:type="dxa"/>
@@ -44512,12 +43753,6 @@
         <w:gridCol w:w="9026"/>
       </w:tblGrid>
       <w:tr>
-        <w:tblPrEx>
-          <w:tblCellMar>
-            <w:top w:w="0" w:type="dxa"/>
-            <w:bottom w:w="0" w:type="dxa"/>
-          </w:tblCellMar>
-        </w:tblPrEx>
         <w:tc>
           <w:tcPr>
             <w:tcW w:w="9026" w:type="dxa"/>
@@ -44544,7 +43779,27 @@
                 <w:sz w:val="22"/>
                 <w:szCs w:val="22"/>
               </w:rPr>
-              <w:t>Data Mart 8: agg_segment_performance.csv — Hiệu suất Segment ★ Mới</w:t>
+              <w:t xml:space="preserve">Data Mart 8: agg_segment_performance.csv — Hiệu suất Segment </w:t>
+            </w:r>
+            <w:r>
+              <w:rPr>
+                <w:b/>
+                <w:bCs/>
+                <w:color w:val="1F4E79"/>
+                <w:sz w:val="22"/>
+                <w:szCs w:val="22"/>
+              </w:rPr>
+              <w:t>m</w:t>
+            </w:r>
+            <w:r>
+              <w:rPr>
+                <w:b/>
+                <w:bCs/>
+                <w:color w:val="1F4E79"/>
+                <w:sz w:val="22"/>
+                <w:szCs w:val="22"/>
+              </w:rPr>
+              <w:t>ới</w:t>
             </w:r>
           </w:p>
         </w:tc>
@@ -44651,12 +43906,6 @@
         <w:gridCol w:w="2227"/>
       </w:tblGrid>
       <w:tr>
-        <w:tblPrEx>
-          <w:tblCellMar>
-            <w:top w:w="0" w:type="dxa"/>
-            <w:bottom w:w="0" w:type="dxa"/>
-          </w:tblCellMar>
-        </w:tblPrEx>
         <w:tc>
           <w:tcPr>
             <w:tcW w:w="3400" w:type="dxa"/>
@@ -44791,12 +44040,6 @@
         </w:tc>
       </w:tr>
       <w:tr>
-        <w:tblPrEx>
-          <w:tblCellMar>
-            <w:top w:w="0" w:type="dxa"/>
-            <w:bottom w:w="0" w:type="dxa"/>
-          </w:tblCellMar>
-        </w:tblPrEx>
         <w:tc>
           <w:tcPr>
             <w:tcW w:w="2340" w:type="dxa"/>
@@ -44907,12 +44150,6 @@
         </w:tc>
       </w:tr>
       <w:tr>
-        <w:tblPrEx>
-          <w:tblCellMar>
-            <w:top w:w="0" w:type="dxa"/>
-            <w:bottom w:w="0" w:type="dxa"/>
-          </w:tblCellMar>
-        </w:tblPrEx>
         <w:tc>
           <w:tcPr>
             <w:tcW w:w="2340" w:type="dxa"/>
@@ -45023,12 +44260,6 @@
         </w:tc>
       </w:tr>
       <w:tr>
-        <w:tblPrEx>
-          <w:tblCellMar>
-            <w:top w:w="0" w:type="dxa"/>
-            <w:bottom w:w="0" w:type="dxa"/>
-          </w:tblCellMar>
-        </w:tblPrEx>
         <w:tc>
           <w:tcPr>
             <w:tcW w:w="2340" w:type="dxa"/>
@@ -45139,12 +44370,6 @@
         </w:tc>
       </w:tr>
       <w:tr>
-        <w:tblPrEx>
-          <w:tblCellMar>
-            <w:top w:w="0" w:type="dxa"/>
-            <w:bottom w:w="0" w:type="dxa"/>
-          </w:tblCellMar>
-        </w:tblPrEx>
         <w:tc>
           <w:tcPr>
             <w:tcW w:w="2340" w:type="dxa"/>
@@ -45255,12 +44480,6 @@
         </w:tc>
       </w:tr>
       <w:tr>
-        <w:tblPrEx>
-          <w:tblCellMar>
-            <w:top w:w="0" w:type="dxa"/>
-            <w:bottom w:w="0" w:type="dxa"/>
-          </w:tblCellMar>
-        </w:tblPrEx>
         <w:tc>
           <w:tcPr>
             <w:tcW w:w="2340" w:type="dxa"/>
@@ -45284,6 +44503,7 @@
                 <w:sz w:val="22"/>
                 <w:szCs w:val="22"/>
               </w:rPr>
+              <w:lastRenderedPageBreak/>
               <w:t>agg_discount_impact.csv</w:t>
             </w:r>
           </w:p>
@@ -45371,12 +44591,6 @@
         </w:tc>
       </w:tr>
       <w:tr>
-        <w:tblPrEx>
-          <w:tblCellMar>
-            <w:top w:w="0" w:type="dxa"/>
-            <w:bottom w:w="0" w:type="dxa"/>
-          </w:tblCellMar>
-        </w:tblPrEx>
         <w:tc>
           <w:tcPr>
             <w:tcW w:w="2340" w:type="dxa"/>
@@ -45487,12 +44701,6 @@
         </w:tc>
       </w:tr>
       <w:tr>
-        <w:tblPrEx>
-          <w:tblCellMar>
-            <w:top w:w="0" w:type="dxa"/>
-            <w:bottom w:w="0" w:type="dxa"/>
-          </w:tblCellMar>
-        </w:tblPrEx>
         <w:tc>
           <w:tcPr>
             <w:tcW w:w="2340" w:type="dxa"/>
@@ -45603,12 +44811,6 @@
         </w:tc>
       </w:tr>
       <w:tr>
-        <w:tblPrEx>
-          <w:tblCellMar>
-            <w:top w:w="0" w:type="dxa"/>
-            <w:bottom w:w="0" w:type="dxa"/>
-          </w:tblCellMar>
-        </w:tblPrEx>
         <w:tc>
           <w:tcPr>
             <w:tcW w:w="2340" w:type="dxa"/>
@@ -45719,12 +44921,6 @@
         </w:tc>
       </w:tr>
       <w:tr>
-        <w:tblPrEx>
-          <w:tblCellMar>
-            <w:top w:w="0" w:type="dxa"/>
-            <w:bottom w:w="0" w:type="dxa"/>
-          </w:tblCellMar>
-        </w:tblPrEx>
         <w:tc>
           <w:tcPr>
             <w:tcW w:w="2340" w:type="dxa"/>
@@ -45835,12 +45031,6 @@
         </w:tc>
       </w:tr>
       <w:tr>
-        <w:tblPrEx>
-          <w:tblCellMar>
-            <w:top w:w="0" w:type="dxa"/>
-            <w:bottom w:w="0" w:type="dxa"/>
-          </w:tblCellMar>
-        </w:tblPrEx>
         <w:tc>
           <w:tcPr>
             <w:tcW w:w="2340" w:type="dxa"/>
@@ -45970,6 +45160,7 @@
           <w:sz w:val="28"/>
           <w:szCs w:val="28"/>
         </w:rPr>
+        <w:lastRenderedPageBreak/>
         <w:t xml:space="preserve">3.6 </w:t>
       </w:r>
       <w:r>
@@ -45984,21 +45175,7 @@
           <w:sz w:val="28"/>
           <w:szCs w:val="28"/>
         </w:rPr>
-        <w:t>ipeline tổng thể (</w:t>
-      </w:r>
-      <w:r>
-        <w:rPr>
-          <w:sz w:val="28"/>
-          <w:szCs w:val="28"/>
-        </w:rPr>
-        <w:t>m</w:t>
-      </w:r>
-      <w:r>
-        <w:rPr>
-          <w:sz w:val="28"/>
-          <w:szCs w:val="28"/>
-        </w:rPr>
-        <w:t>odule: main.py)</w:t>
+        <w:t xml:space="preserve">ipeline tổng thể </w:t>
       </w:r>
     </w:p>
     <w:p>
@@ -46168,12 +45345,6 @@
         <w:gridCol w:w="2189"/>
       </w:tblGrid>
       <w:tr>
-        <w:tblPrEx>
-          <w:tblCellMar>
-            <w:top w:w="0" w:type="dxa"/>
-            <w:bottom w:w="0" w:type="dxa"/>
-          </w:tblCellMar>
-        </w:tblPrEx>
         <w:tc>
           <w:tcPr>
             <w:tcW w:w="600" w:type="dxa"/>
@@ -46341,12 +45512,6 @@
         </w:tc>
       </w:tr>
       <w:tr>
-        <w:tblPrEx>
-          <w:tblCellMar>
-            <w:top w:w="0" w:type="dxa"/>
-            <w:bottom w:w="0" w:type="dxa"/>
-          </w:tblCellMar>
-        </w:tblPrEx>
         <w:tc>
           <w:tcPr>
             <w:tcW w:w="2340" w:type="dxa"/>
@@ -46484,12 +45649,6 @@
         </w:tc>
       </w:tr>
       <w:tr>
-        <w:tblPrEx>
-          <w:tblCellMar>
-            <w:top w:w="0" w:type="dxa"/>
-            <w:bottom w:w="0" w:type="dxa"/>
-          </w:tblCellMar>
-        </w:tblPrEx>
         <w:tc>
           <w:tcPr>
             <w:tcW w:w="2340" w:type="dxa"/>
@@ -46627,12 +45786,6 @@
         </w:tc>
       </w:tr>
       <w:tr>
-        <w:tblPrEx>
-          <w:tblCellMar>
-            <w:top w:w="0" w:type="dxa"/>
-            <w:bottom w:w="0" w:type="dxa"/>
-          </w:tblCellMar>
-        </w:tblPrEx>
         <w:tc>
           <w:tcPr>
             <w:tcW w:w="2340" w:type="dxa"/>
@@ -46770,12 +45923,6 @@
         </w:tc>
       </w:tr>
       <w:tr>
-        <w:tblPrEx>
-          <w:tblCellMar>
-            <w:top w:w="0" w:type="dxa"/>
-            <w:bottom w:w="0" w:type="dxa"/>
-          </w:tblCellMar>
-        </w:tblPrEx>
         <w:tc>
           <w:tcPr>
             <w:tcW w:w="2340" w:type="dxa"/>
@@ -46913,12 +46060,6 @@
         </w:tc>
       </w:tr>
       <w:tr>
-        <w:tblPrEx>
-          <w:tblCellMar>
-            <w:top w:w="0" w:type="dxa"/>
-            <w:bottom w:w="0" w:type="dxa"/>
-          </w:tblCellMar>
-        </w:tblPrEx>
         <w:tc>
           <w:tcPr>
             <w:tcW w:w="2340" w:type="dxa"/>
@@ -47141,12 +46282,6 @@
         <w:gridCol w:w="3013"/>
       </w:tblGrid>
       <w:tr>
-        <w:tblPrEx>
-          <w:tblCellMar>
-            <w:top w:w="0" w:type="dxa"/>
-            <w:bottom w:w="0" w:type="dxa"/>
-          </w:tblCellMar>
-        </w:tblPrEx>
         <w:tc>
           <w:tcPr>
             <w:tcW w:w="3000" w:type="dxa"/>
@@ -47248,12 +46383,6 @@
         </w:tc>
       </w:tr>
       <w:tr>
-        <w:tblPrEx>
-          <w:tblCellMar>
-            <w:top w:w="0" w:type="dxa"/>
-            <w:bottom w:w="0" w:type="dxa"/>
-          </w:tblCellMar>
-        </w:tblPrEx>
         <w:tc>
           <w:tcPr>
             <w:tcW w:w="2340" w:type="dxa"/>
@@ -47337,12 +46466,6 @@
         </w:tc>
       </w:tr>
       <w:tr>
-        <w:tblPrEx>
-          <w:tblCellMar>
-            <w:top w:w="0" w:type="dxa"/>
-            <w:bottom w:w="0" w:type="dxa"/>
-          </w:tblCellMar>
-        </w:tblPrEx>
         <w:tc>
           <w:tcPr>
             <w:tcW w:w="2340" w:type="dxa"/>
@@ -47366,6 +46489,7 @@
                 <w:sz w:val="22"/>
                 <w:szCs w:val="22"/>
               </w:rPr>
+              <w:lastRenderedPageBreak/>
               <w:t>Đặc trưng phân tích</w:t>
             </w:r>
           </w:p>
@@ -47426,12 +46550,6 @@
         </w:tc>
       </w:tr>
       <w:tr>
-        <w:tblPrEx>
-          <w:tblCellMar>
-            <w:top w:w="0" w:type="dxa"/>
-            <w:bottom w:w="0" w:type="dxa"/>
-          </w:tblCellMar>
-        </w:tblPrEx>
         <w:tc>
           <w:tcPr>
             <w:tcW w:w="2340" w:type="dxa"/>
@@ -47515,12 +46633,6 @@
         </w:tc>
       </w:tr>
       <w:tr>
-        <w:tblPrEx>
-          <w:tblCellMar>
-            <w:top w:w="0" w:type="dxa"/>
-            <w:bottom w:w="0" w:type="dxa"/>
-          </w:tblCellMar>
-        </w:tblPrEx>
         <w:tc>
           <w:tcPr>
             <w:tcW w:w="2340" w:type="dxa"/>
@@ -47604,12 +46716,6 @@
         </w:tc>
       </w:tr>
       <w:tr>
-        <w:tblPrEx>
-          <w:tblCellMar>
-            <w:top w:w="0" w:type="dxa"/>
-            <w:bottom w:w="0" w:type="dxa"/>
-          </w:tblCellMar>
-        </w:tblPrEx>
         <w:tc>
           <w:tcPr>
             <w:tcW w:w="2340" w:type="dxa"/>
@@ -47693,12 +46799,6 @@
         </w:tc>
       </w:tr>
       <w:tr>
-        <w:tblPrEx>
-          <w:tblCellMar>
-            <w:top w:w="0" w:type="dxa"/>
-            <w:bottom w:w="0" w:type="dxa"/>
-          </w:tblCellMar>
-        </w:tblPrEx>
         <w:tc>
           <w:tcPr>
             <w:tcW w:w="2340" w:type="dxa"/>
@@ -47808,12 +46908,6 @@
         <w:gridCol w:w="9026"/>
       </w:tblGrid>
       <w:tr>
-        <w:tblPrEx>
-          <w:tblCellMar>
-            <w:top w:w="0" w:type="dxa"/>
-            <w:bottom w:w="0" w:type="dxa"/>
-          </w:tblCellMar>
-        </w:tblPrEx>
         <w:tc>
           <w:tcPr>
             <w:tcW w:w="9026" w:type="dxa"/>
@@ -47882,8 +46976,8 @@
       </w:pPr>
     </w:p>
     <w:sectPr>
-      <w:headerReference w:type="default" r:id="rId11"/>
-      <w:footerReference w:type="default" r:id="rId12"/>
+      <w:headerReference w:type="default" r:id="rId12"/>
+      <w:footerReference w:type="default" r:id="rId13"/>
       <w:pgSz w:w="12240" w:h="15840"/>
       <w:pgMar w:top="1440" w:right="1440" w:bottom="1440" w:left="1440" w:header="720" w:footer="720" w:gutter="0"/>
       <w:pgNumType w:start="0"/>
@@ -55198,28 +54292,28 @@
 </file>
 
 <file path=customXml/item1.xml><?xml version="1.0" encoding="utf-8"?>
+<b:Sources xmlns:b="http://schemas.openxmlformats.org/officeDocument/2006/bibliography" xmlns="http://schemas.openxmlformats.org/officeDocument/2006/bibliography" SelectedStyle="\APASixthEditionOfficeOnline.xsl" StyleName="APA" Version="6"/>
+</file>
+
+<file path=customXml/item2.xml><?xml version="1.0" encoding="utf-8"?>
 <go:gDocsCustomXmlDataStorage xmlns:go="http://customooxmlschemas.google.com/" xmlns:r="http://schemas.openxmlformats.org/officeDocument/2006/relationships" uri="GoogleDocsCustomDataVersion2">
   <go:docsCustomData xmlns:go="http://customooxmlschemas.google.com/" roundtripDataSignature="AMtx7mgiPnSzeFcphxz7x95siPLEGky12A==">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</go:docsCustomData>
 </go:gDocsCustomXmlDataStorage>
 </file>
 
-<file path=customXml/item2.xml><?xml version="1.0" encoding="utf-8"?>
-<b:Sources xmlns:b="http://schemas.openxmlformats.org/officeDocument/2006/bibliography" xmlns="http://schemas.openxmlformats.org/officeDocument/2006/bibliography" SelectedStyle="\APASixthEditionOfficeOnline.xsl" StyleName="APA" Version="6"/>
+<file path=customXml/itemProps1.xml><?xml version="1.0" encoding="utf-8"?>
+<ds:datastoreItem xmlns:ds="http://schemas.openxmlformats.org/officeDocument/2006/customXml" ds:itemID="{6BA7E6F1-37ED-4F0B-9095-9991D41BCB91}">
+  <ds:schemaRefs>
+    <ds:schemaRef ds:uri="http://schemas.openxmlformats.org/officeDocument/2006/bibliography"/>
+  </ds:schemaRefs>
+</ds:datastoreItem>
 </file>
 
-<file path=customXml/itemProps1.xml><?xml version="1.0" encoding="utf-8"?>
+<file path=customXml/itemProps2.xml><?xml version="1.0" encoding="utf-8"?>
 <ds:datastoreItem xmlns:ds="http://schemas.openxmlformats.org/officeDocument/2006/customXml" ds:itemID="{11111111-1234-1234-1234-123412341234}">
   <ds:schemaRefs>
     <ds:schemaRef ds:uri="http://customooxmlschemas.google.com/"/>
     <ds:schemaRef ds:uri="http://schemas.openxmlformats.org/officeDocument/2006/relationships"/>
   </ds:schemaRefs>
 </ds:datastoreItem>
-</file>
-
-<file path=customXml/itemProps2.xml><?xml version="1.0" encoding="utf-8"?>
-<ds:datastoreItem xmlns:ds="http://schemas.openxmlformats.org/officeDocument/2006/customXml" ds:itemID="{6BA7E6F1-37ED-4F0B-9095-9991D41BCB91}">
-  <ds:schemaRefs>
-    <ds:schemaRef ds:uri="http://schemas.openxmlformats.org/officeDocument/2006/bibliography"/>
-  </ds:schemaRefs>
-</ds:datastoreItem>
 </file>
</xml_diff>